<commit_message>
added elements and fixed tests
</commit_message>
<xml_diff>
--- a/test/Parser/Tag/Resources/tag_generator_test_document_lck.docx
+++ b/test/Parser/Tag/Resources/tag_generator_test_document_lck.docx
@@ -89,7 +89,7 @@
           <w:color w:val="FF0000"/>
           <w:sz w:val="32"/>
         </w:rPr>
-        <acat:field xmlns:acat="https://schemas.acat.akademie.uni-bremen.de" id="8f3aea7b-ee19-4677-9cac-175222fd2e4b" field="1121"/>
+        <acat:field xmlns:acat="https://schemas.acat.akademie.uni-bremen.de" id="dc494a80-defd-46bf-8ccc-25a7f63f344b" field="1121"/>
       </w:r>
     </w:p>
     <w:p>
@@ -136,9 +136,9 @@
         <w:rPr>
           <w:rFonts w:ascii="Trebuchet MS" w:hAnsi="Trebuchet MS"/>
         </w:rPr>
-        <acat:condition xmlns:acat="https://schemas.acat.akademie.uni-bremen.de" id="3bf287a8-abc2-488f-adef-9631aa4c719b" field="1760" action="0"><![CDATA[<>]]></acat:condition>
-        <acat:condition xmlns:acat="https://schemas.acat.akademie.uni-bremen.de" id="62e43123-597d-4190-a63f-68199ff8197d" field="1858" action="0"><![CDATA[=]]></acat:condition>
-        <acat:field xmlns:acat="https://schemas.acat.akademie.uni-bremen.de" id="55de4eb1-1f5e-4992-955d-6d24defbb353" field="1858"/>
+        <acat:condition xmlns:acat="https://schemas.acat.akademie.uni-bremen.de" id="f38bf626-125e-45da-b30e-944bf29c282f" field="1760" action="0"><![CDATA[<>]]></acat:condition>
+        <acat:condition xmlns:acat="https://schemas.acat.akademie.uni-bremen.de" id="efce6555-18c0-42b1-b09c-ad70836dd3b7" field="1858" action="0"><![CDATA[=]]></acat:condition>
+        <acat:field xmlns:acat="https://schemas.acat.akademie.uni-bremen.de" id="ab87d1d1-4480-4e55-8b76-af9fff12471c" field="1858"/>
         <w:t xml:space="preserve"> </w:t>
       </w:r>
     </w:p>
@@ -154,9 +154,9 @@
         <w:rPr>
           <w:rFonts w:ascii="Trebuchet MS" w:hAnsi="Trebuchet MS"/>
         </w:rPr>
-        <acat:condition xmlns:acat="https://schemas.acat.akademie.uni-bremen.de" id="d31f4d47-ef83-4095-9b1e-8534a985b340" field="1760" action="0"><![CDATA[<>]]></acat:condition>
-        <acat:condition xmlns:acat="https://schemas.acat.akademie.uni-bremen.de" id="c84a2f6e-bacd-44d8-9063-187b8244afc7" field="1744" action="0"><![CDATA[=]]></acat:condition>
-        <acat:field xmlns:acat="https://schemas.acat.akademie.uni-bremen.de" id="d519dd9e-cea0-4447-86b2-9b6d11bba2a1" field="1744"/>
+        <acat:condition xmlns:acat="https://schemas.acat.akademie.uni-bremen.de" id="56600b12-38e6-4ab3-b3e0-a2c16e6dd5c0" field="1760" action="0"><![CDATA[<>]]></acat:condition>
+        <acat:condition xmlns:acat="https://schemas.acat.akademie.uni-bremen.de" id="7dd8960c-860e-4abe-ba4d-4b71a0c0eb23" field="1744" action="0"><![CDATA[=]]></acat:condition>
+        <acat:field xmlns:acat="https://schemas.acat.akademie.uni-bremen.de" id="516df63f-cb4a-4759-afbf-b0a4b4acc34e" field="1744"/>
       </w:r>
     </w:p>
     <w:p>
@@ -171,13 +171,13 @@
         <w:rPr>
           <w:rFonts w:ascii="Trebuchet MS" w:hAnsi="Trebuchet MS"/>
         </w:rPr>
-        <acat:condition xmlns:acat="https://schemas.acat.akademie.uni-bremen.de" id="6ec5e3bd-3803-4428-8a1c-7140f773a570" field="1760" action="0"><![CDATA[<>]]></acat:condition>
-        <acat:condition xmlns:acat="https://schemas.acat.akademie.uni-bremen.de" id="c843d947-9d61-4e40-8630-2721aec1d7ff" field="1752" action="2"><![CDATA[=]]></acat:condition>
-        <acat:field xmlns:acat="https://schemas.acat.akademie.uni-bremen.de" id="1880262d-929b-410b-aa0c-54321fc1539d" field="1752"/>
+        <acat:condition xmlns:acat="https://schemas.acat.akademie.uni-bremen.de" id="0cef5ceb-5abc-4786-9cbe-2100a32a2c05" field="1760" action="0"><![CDATA[<>]]></acat:condition>
+        <acat:condition xmlns:acat="https://schemas.acat.akademie.uni-bremen.de" id="9aa513b3-6ad2-4d97-853d-84c18a11617e" field="1752" action="2"><![CDATA[=]]></acat:condition>
+        <acat:field xmlns:acat="https://schemas.acat.akademie.uni-bremen.de" id="bc7f11f5-f76e-402d-9ac6-0b5cda759b2f" field="1752"/>
         <w:t xml:space="preserve"> </w:t>
-        <acat:field xmlns:acat="https://schemas.acat.akademie.uni-bremen.de" id="96f0b20b-a6d9-40a4-9c48-b81086eef365" field="1745"/>
+        <acat:field xmlns:acat="https://schemas.acat.akademie.uni-bremen.de" id="38e0bcb1-d885-4b13-af8f-1a0495e685ba" field="1745"/>
         <w:t xml:space="preserve"> </w:t>
-        <acat:field xmlns:acat="https://schemas.acat.akademie.uni-bremen.de" id="5fb8dbdd-8e3e-4395-a477-d7641b554783" field="1747"/>
+        <acat:field xmlns:acat="https://schemas.acat.akademie.uni-bremen.de" id="dc789418-1917-41c9-89ab-590b0f525c18" field="1747"/>
       </w:r>
     </w:p>
     <w:p>
@@ -192,8 +192,8 @@
         <w:rPr>
           <w:rFonts w:ascii="Trebuchet MS" w:hAnsi="Trebuchet MS"/>
         </w:rPr>
-        <acat:condition xmlns:acat="https://schemas.acat.akademie.uni-bremen.de" id="24c83a84-123c-4cbd-aa02-bb669c740abc" field="1760" action="0"><![CDATA[<>]]></acat:condition>
-        <acat:field xmlns:acat="https://schemas.acat.akademie.uni-bremen.de" id="9785372e-b699-49b6-a06d-7d445ce7f61e" field="1748"/>
+        <acat:condition xmlns:acat="https://schemas.acat.akademie.uni-bremen.de" id="c730a6ba-0415-4dc6-a560-cd3f0921fe6d" field="1760" action="0"><![CDATA[<>]]></acat:condition>
+        <acat:field xmlns:acat="https://schemas.acat.akademie.uni-bremen.de" id="2c3f3654-a8bc-42a0-99a2-0192a42a6d71" field="1748"/>
       </w:r>
     </w:p>
     <w:p>
@@ -208,10 +208,10 @@
         <w:rPr>
           <w:rFonts w:ascii="Trebuchet MS" w:hAnsi="Trebuchet MS"/>
         </w:rPr>
-        <acat:condition xmlns:acat="https://schemas.acat.akademie.uni-bremen.de" id="3fc1455e-b929-4bcd-b954-d21bc9db3da2" field="1760" action="0"><![CDATA[<>]]></acat:condition>
-        <acat:field xmlns:acat="https://schemas.acat.akademie.uni-bremen.de" id="0a4bfa06-69b2-4c90-8255-d4dedaef4551" field="1749"/>
+        <acat:condition xmlns:acat="https://schemas.acat.akademie.uni-bremen.de" id="6c509650-6fa2-4438-b803-5a088d2a09c1" field="1760" action="0"><![CDATA[<>]]></acat:condition>
+        <acat:field xmlns:acat="https://schemas.acat.akademie.uni-bremen.de" id="7ad06f2a-eef8-4d54-913a-2e94c5dd2c0f" field="1749"/>
         <w:t xml:space="preserve"> </w:t>
-        <acat:field xmlns:acat="https://schemas.acat.akademie.uni-bremen.de" id="01afb0c8-abca-43d9-88ca-8f0e3f1a574d" field="1750"/>
+        <acat:field xmlns:acat="https://schemas.acat.akademie.uni-bremen.de" id="aba7dd47-ad7b-4fde-a22e-8fe1a8797078" field="1750"/>
       </w:r>
     </w:p>
     <w:p>
@@ -226,8 +226,8 @@
         <w:rPr>
           <w:rFonts w:ascii="Trebuchet MS" w:hAnsi="Trebuchet MS"/>
         </w:rPr>
-        <acat:condition xmlns:acat="https://schemas.acat.akademie.uni-bremen.de" id="bf30a136-a702-43c1-98d2-dde87edf4cb9" field="1757" action="0"><![CDATA[=]]></acat:condition>
-        <acat:field xmlns:acat="https://schemas.acat.akademie.uni-bremen.de" id="7c260786-e722-45c2-aebf-f08815ac96d0" field="1757"/>
+        <acat:condition xmlns:acat="https://schemas.acat.akademie.uni-bremen.de" id="357e3fb3-625c-4cae-a4f0-694f0b4c86f9" field="1757" action="0"><![CDATA[=]]></acat:condition>
+        <acat:field xmlns:acat="https://schemas.acat.akademie.uni-bremen.de" id="f3e04a75-6f32-4d52-a1c4-8df8bd98077d" field="1757"/>
         <w:t xml:space="preserve"> </w:t>
       </w:r>
     </w:p>
@@ -243,8 +243,8 @@
         <w:rPr>
           <w:rFonts w:ascii="Trebuchet MS" w:hAnsi="Trebuchet MS"/>
         </w:rPr>
-        <acat:condition xmlns:acat="https://schemas.acat.akademie.uni-bremen.de" id="0199471e-a301-43fe-92bf-f27e3934558b" field="1860" action="0"><![CDATA[=]]></acat:condition>
-        <acat:field xmlns:acat="https://schemas.acat.akademie.uni-bremen.de" id="ad8bbf6d-6986-41a2-82c1-b6b31e52aa5d" field="1860"/>
+        <acat:condition xmlns:acat="https://schemas.acat.akademie.uni-bremen.de" id="15723f97-bf85-42e4-bc62-a7be1674fcd0" field="1860" action="0"><![CDATA[=]]></acat:condition>
+        <acat:field xmlns:acat="https://schemas.acat.akademie.uni-bremen.de" id="6078f620-dfcc-44b6-9184-4195ff591636" field="1860"/>
         <w:t xml:space="preserve"> </w:t>
       </w:r>
     </w:p>
@@ -260,10 +260,10 @@
         <w:rPr>
           <w:rFonts w:ascii="Trebuchet MS" w:hAnsi="Trebuchet MS"/>
         </w:rPr>
-        <acat:condition xmlns:acat="https://schemas.acat.akademie.uni-bremen.de" id="51aed777-e025-4104-aa31-adf427ea6e2a" field="1862" action="0"><![CDATA[=]]></acat:condition>
-        <acat:field xmlns:acat="https://schemas.acat.akademie.uni-bremen.de" id="d8e95a87-ca03-4015-a5b8-6e1e865946b8" field="1862"/>
+        <acat:condition xmlns:acat="https://schemas.acat.akademie.uni-bremen.de" id="c5f8c184-541b-4fd9-a08a-db5ef1fec585" field="1862" action="0"><![CDATA[=]]></acat:condition>
+        <acat:field xmlns:acat="https://schemas.acat.akademie.uni-bremen.de" id="81f12117-2a35-48d1-aedb-8a18dc522736" field="1862"/>
         <w:t xml:space="preserve"> </w:t>
-        <acat:field xmlns:acat="https://schemas.acat.akademie.uni-bremen.de" id="0ffe5426-34b8-4300-a736-4464d5f329ae" field="1863"/>
+        <acat:field xmlns:acat="https://schemas.acat.akademie.uni-bremen.de" id="2ca37f34-2982-44f3-9941-25af82ac373a" field="1863"/>
       </w:r>
     </w:p>
     <w:p>
@@ -278,8 +278,8 @@
         <w:rPr>
           <w:rFonts w:ascii="Trebuchet MS" w:hAnsi="Trebuchet MS"/>
         </w:rPr>
-        <acat:condition xmlns:acat="https://schemas.acat.akademie.uni-bremen.de" id="35a4912d-b4de-4872-981a-37c11c3a8b81" field="1760" action="0"><![CDATA[=]]></acat:condition>
-        <acat:field xmlns:acat="https://schemas.acat.akademie.uni-bremen.de" id="d1910b44-1b55-440b-8fd6-55cb682177ea" field="1760"/>
+        <acat:condition xmlns:acat="https://schemas.acat.akademie.uni-bremen.de" id="8536a091-956c-48e2-8e96-02337db4836b" field="1760" action="0"><![CDATA[=]]></acat:condition>
+        <acat:field xmlns:acat="https://schemas.acat.akademie.uni-bremen.de" id="9aa3741d-23f5-4742-8d64-45ece0d69c95" field="1760"/>
       </w:r>
     </w:p>
     <w:p>
@@ -294,10 +294,10 @@
         <w:rPr>
           <w:rFonts w:ascii="Trebuchet MS" w:hAnsi="Trebuchet MS"/>
         </w:rPr>
-        <acat:condition xmlns:acat="https://schemas.acat.akademie.uni-bremen.de" id="bf5e9cb4-61e6-42be-be48-0d942299a1f9" field="1761" action="0"><![CDATA[=]]></acat:condition>
-        <acat:field xmlns:acat="https://schemas.acat.akademie.uni-bremen.de" id="45309f7d-efc0-4749-b375-216778a2ccd4" field="1761"/>
+        <acat:condition xmlns:acat="https://schemas.acat.akademie.uni-bremen.de" id="f09462b1-5d39-4318-b525-007dea083234" field="1761" action="0"><![CDATA[=]]></acat:condition>
+        <acat:field xmlns:acat="https://schemas.acat.akademie.uni-bremen.de" id="4b62d7ff-5fb8-435d-979a-f828771d1292" field="1761"/>
         <w:t xml:space="preserve"> </w:t>
-        <acat:field xmlns:acat="https://schemas.acat.akademie.uni-bremen.de" id="6b659bde-c226-40f7-8f11-93ce26159dbd" field="1762"/>
+        <acat:field xmlns:acat="https://schemas.acat.akademie.uni-bremen.de" id="28185b3e-2ebe-4135-a289-f0cc24b4da5f" field="1762"/>
       </w:r>
     </w:p>
     <w:p>
@@ -326,7 +326,7 @@
         <w:rPr>
           <w:rFonts w:ascii="Trebuchet MS" w:hAnsi="Trebuchet MS"/>
         </w:rPr>
-        <acat:field xmlns:acat="https://schemas.acat.akademie.uni-bremen.de" id="1d2a2a39-f753-430b-8457-d806e196de72" field="1858"/>
+        <acat:field xmlns:acat="https://schemas.acat.akademie.uni-bremen.de" id="74a6262f-5dbe-463e-922b-9d076afb5711" field="1858"/>
       </w:r>
       <w:r>
         <w:rPr>
@@ -338,7 +338,7 @@
         <w:rPr>
           <w:rFonts w:ascii="Trebuchet MS" w:hAnsi="Trebuchet MS"/>
         </w:rPr>
-        <acat:field xmlns:acat="https://schemas.acat.akademie.uni-bremen.de" id="f4a9a165-c4dd-4436-977e-e89ab5ecdf6c" field="1762"/>
+        <acat:field xmlns:acat="https://schemas.acat.akademie.uni-bremen.de" id="6c80a496-f7f3-46c3-8107-14b8574e2e22" field="1762"/>
       </w:r>
       <w:r>
         <w:rPr>
@@ -350,16 +350,16 @@
         <w:rPr>
           <w:rFonts w:ascii="Trebuchet MS" w:hAnsi="Trebuchet MS"/>
         </w:rPr>
-        <acat:field xmlns:acat="https://schemas.acat.akademie.uni-bremen.de" id="744024a7-cc01-4e74-af09-b08365592e97" field="1757"/>
+        <acat:field xmlns:acat="https://schemas.acat.akademie.uni-bremen.de" id="118a7d5b-52d2-4d30-a78b-770bcb358704" field="1757"/>
       </w:r>
       <w:r>
         <w:rPr>
           <w:rFonts w:ascii="Trebuchet MS" w:hAnsi="Trebuchet MS"/>
         </w:rPr>
         <w:t xml:space="preserve"> Felder einbauen, sonst spiegelt das ja nicht wirklich die Realität wieder. Aber was wäre das Leben ohne die Möglichkeit Entscheidungen treffen zu können!? Deswegen </w:t>
-        <acat:condition xmlns:acat="https://schemas.acat.akademie.uni-bremen.de" id="e824392a-41ca-431f-ba7f-8e5eddfe5be3" field="1760" action="0"><![CDATA[=]]></acat:condition>
+        <acat:condition xmlns:acat="https://schemas.acat.akademie.uni-bremen.de" id="d6bccbc1-ba87-47df-bb5b-c5cdb3add2c4" field="1760" action="0"><![CDATA[=]]></acat:condition>
         <w:t xml:space="preserve"> </w:t>
-        <acat:text xmlns:acat="https://schemas.acat.akademie.uni-bremen.de" id="5d9e2887-90c8-48fc-9c31-cab3e3c4634c" space="preserve">Hurray</acat:text>
+        <acat:text xmlns:acat="https://schemas.acat.akademie.uni-bremen.de" id="0590507b-08bc-40bd-aef7-1ead70f41c95" space="preserve">Hurray</acat:text>
         <w:t xml:space="preserve">. Läuft, oder!? :-P </w:t>
       </w:r>
       <w:proofErr w:type="spellStart"/>
@@ -397,7 +397,7 @@
         <w:rPr>
           <w:rFonts w:ascii="Trebuchet MS" w:hAnsi="Trebuchet MS"/>
         </w:rPr>
-        <acat:field xmlns:acat="https://schemas.acat.akademie.uni-bremen.de" id="ecfa7927-1911-4088-af92-2a638386e857" field="156"/>
+        <acat:field xmlns:acat="https://schemas.acat.akademie.uni-bremen.de" id="5de69f46-d89c-4ecd-96fb-d07a6bf794ef" field="156"/>
         <w:t xml:space="preserve"> Es soll das Feld mit der ID 156 gedruckt werden</w:t>
       </w:r>
     </w:p>
@@ -436,7 +436,7 @@
         <w:rPr>
           <w:rFonts w:ascii="Trebuchet MS" w:hAnsi="Trebuchet MS"/>
         </w:rPr>
-        <acat:text xmlns:acat="https://schemas.acat.akademie.uni-bremen.de" id="339ffe58-9e2c-4ef7-82b1-f0ee394418c8" space="preserve">FOO BAR</acat:text>
+        <acat:text xmlns:acat="https://schemas.acat.akademie.uni-bremen.de" id="33f40b7b-74a4-40e3-a2a6-e5f5125928ed" space="preserve">FOO BAR</acat:text>
         <w:t xml:space="preserve"> Hier handelt es sich um ein Textfeld, welches den Inhalt „FOO BAR“ ausdruckt.</w:t>
       </w:r>
     </w:p>
@@ -506,7 +506,7 @@
         <w:rPr>
           <w:rFonts w:ascii="Arial" w:hAnsi="Arial" w:cs="Arial"/>
         </w:rPr>
-        <acat:block xmlns:acat="https://schemas.acat.akademie.uni-bremen.de" id="7dfc0f25-c0fc-47c5-8950-d115ab3c70bd" type="start"/>
+        <acat:block xmlns:acat="https://schemas.acat.akademie.uni-bremen.de" id="40f268bf-a0ff-4c60-9dc7-d20bab5e0abf" type="start"/>
       </w:r>
     </w:p>
     <w:p>
@@ -520,20 +520,20 @@
         <w:rPr>
           <w:rFonts w:ascii="Arial" w:hAnsi="Arial" w:cs="Arial"/>
         </w:rPr>
-        <acat:field xmlns:acat="https://schemas.acat.akademie.uni-bremen.de" id="76751364-2062-4809-978b-188d8a08ca3d" field="156"/>
-      </w:r>
-    </w:p>
-    <w:p>
-      <w:pPr>
-        <w:rPr>
-          <w:rFonts w:ascii="Arial" w:hAnsi="Arial" w:cs="Arial"/>
-        </w:rPr>
-      </w:pPr>
-      <w:r>
-        <w:rPr>
-          <w:rFonts w:ascii="Arial" w:hAnsi="Arial" w:cs="Arial"/>
-        </w:rPr>
-        <acat:block xmlns:acat="https://schemas.acat.akademie.uni-bremen.de" id="a9a4be90-2f8a-4e8f-b71e-4f216e8bb7ad" type="end"/>
+        <acat:field xmlns:acat="https://schemas.acat.akademie.uni-bremen.de" id="9b39242c-7790-4cb8-b897-c81682709ab6" field="156"/>
+      </w:r>
+    </w:p>
+    <w:p>
+      <w:pPr>
+        <w:rPr>
+          <w:rFonts w:ascii="Arial" w:hAnsi="Arial" w:cs="Arial"/>
+        </w:rPr>
+      </w:pPr>
+      <w:r>
+        <w:rPr>
+          <w:rFonts w:ascii="Arial" w:hAnsi="Arial" w:cs="Arial"/>
+        </w:rPr>
+        <acat:block xmlns:acat="https://schemas.acat.akademie.uni-bremen.de" id="a9a98a6d-e7a6-4ee6-a6cf-78c7ec894652" type="end"/>
       </w:r>
     </w:p>
     <w:p>
@@ -633,11 +633,11 @@
         <w:rPr>
           <w:rFonts w:ascii="Arial" w:hAnsi="Arial" w:cs="Arial"/>
         </w:rPr>
-        <acat:block xmlns:acat="https://schemas.acat.akademie.uni-bremen.de" id="6839f413-9390-4f85-b59e-7cb21cc28f10" type="start"/>
+        <acat:block xmlns:acat="https://schemas.acat.akademie.uni-bremen.de" id="b34e64a5-6714-4653-8475-9a8d4270a00d" type="start"/>
         <w:t xml:space="preserve"> </w:t>
-        <acat:field xmlns:acat="https://schemas.acat.akademie.uni-bremen.de" id="b705b501-7931-43b7-922d-17abf70532d6" field="157"/>
+        <acat:field xmlns:acat="https://schemas.acat.akademie.uni-bremen.de" id="69890673-57d9-44c1-b9b0-7429356acf76" field="157"/>
         <w:t xml:space="preserve"> </w:t>
-        <acat:block xmlns:acat="https://schemas.acat.akademie.uni-bremen.de" id="1c5d5593-7a88-4372-8b08-38c21a9e580e" type="end"/>
+        <acat:block xmlns:acat="https://schemas.acat.akademie.uni-bremen.de" id="38c6d8d9-9733-4a4c-9b6c-2f6d49f78c93" type="end"/>
       </w:r>
     </w:p>
     <w:p>
@@ -665,33 +665,33 @@
         <w:rPr>
           <w:rFonts w:ascii="Arial" w:hAnsi="Arial" w:cs="Arial"/>
         </w:rPr>
-        <acat:block xmlns:acat="https://schemas.acat.akademie.uni-bremen.de" id="e1a19c28-300e-4656-9d06-ccc7d405e87d" type="start"/>
-      </w:r>
-    </w:p>
-    <w:p>
-      <w:pPr>
-        <w:rPr>
-          <w:rFonts w:ascii="Arial" w:hAnsi="Arial" w:cs="Arial"/>
-        </w:rPr>
-      </w:pPr>
-      <w:r>
-        <w:rPr>
-          <w:rFonts w:ascii="Arial" w:hAnsi="Arial" w:cs="Arial"/>
-        </w:rPr>
-        <acat:field xmlns:acat="https://schemas.acat.akademie.uni-bremen.de" id="1866b00f-1c79-4121-bdfb-25fd02343b42" field="156"/>
-      </w:r>
-    </w:p>
-    <w:p>
-      <w:pPr>
-        <w:rPr>
-          <w:rFonts w:ascii="Arial" w:hAnsi="Arial" w:cs="Arial"/>
-        </w:rPr>
-      </w:pPr>
-      <w:r>
-        <w:rPr>
-          <w:rFonts w:ascii="Arial" w:hAnsi="Arial" w:cs="Arial"/>
-        </w:rPr>
-        <acat:block xmlns:acat="https://schemas.acat.akademie.uni-bremen.de" id="1bc40658-91a7-4b23-a928-60c24b93a39f" type="end"/>
+        <acat:block xmlns:acat="https://schemas.acat.akademie.uni-bremen.de" id="42ca6575-fbce-4bfa-a711-7f58744d2a3e" type="start"/>
+      </w:r>
+    </w:p>
+    <w:p>
+      <w:pPr>
+        <w:rPr>
+          <w:rFonts w:ascii="Arial" w:hAnsi="Arial" w:cs="Arial"/>
+        </w:rPr>
+      </w:pPr>
+      <w:r>
+        <w:rPr>
+          <w:rFonts w:ascii="Arial" w:hAnsi="Arial" w:cs="Arial"/>
+        </w:rPr>
+        <acat:field xmlns:acat="https://schemas.acat.akademie.uni-bremen.de" id="4b8d426b-d266-4b84-ae5f-cb9c51b9367b" field="156"/>
+      </w:r>
+    </w:p>
+    <w:p>
+      <w:pPr>
+        <w:rPr>
+          <w:rFonts w:ascii="Arial" w:hAnsi="Arial" w:cs="Arial"/>
+        </w:rPr>
+      </w:pPr>
+      <w:r>
+        <w:rPr>
+          <w:rFonts w:ascii="Arial" w:hAnsi="Arial" w:cs="Arial"/>
+        </w:rPr>
+        <acat:block xmlns:acat="https://schemas.acat.akademie.uni-bremen.de" id="55591655-34e7-4280-bdb7-7c1280c741b5" type="end"/>
       </w:r>
     </w:p>
     <w:p>
@@ -1082,7 +1082,7 @@
               <w:rPr>
                 <w:rFonts w:ascii="Arial" w:hAnsi="Arial" w:cs="Arial"/>
               </w:rPr>
-              <acat:block xmlns:acat="https://schemas.acat.akademie.uni-bremen.de" id="c1203c28-43dc-4bbc-b83a-3ed4179b73fc" type="start"/>
+              <acat:block xmlns:acat="https://schemas.acat.akademie.uni-bremen.de" id="60be7fad-d004-41ef-99ae-9565bd5ec2b5" type="start"/>
               <w:t xml:space="preserve"> </w:t>
             </w:r>
           </w:p>
@@ -1101,7 +1101,7 @@
               <w:rPr>
                 <w:rFonts w:ascii="Arial" w:hAnsi="Arial" w:cs="Arial"/>
               </w:rPr>
-              <acat:field xmlns:acat="https://schemas.acat.akademie.uni-bremen.de" id="43ccc815-9bc8-4609-a1d4-9a5d90e199c0" field="156"/>
+              <acat:field xmlns:acat="https://schemas.acat.akademie.uni-bremen.de" id="fe6e9d90-2902-4120-8194-a9d38f17438c" field="156"/>
             </w:r>
           </w:p>
         </w:tc>
@@ -1119,7 +1119,7 @@
               <w:rPr>
                 <w:rFonts w:ascii="Arial" w:hAnsi="Arial" w:cs="Arial"/>
               </w:rPr>
-              <acat:field xmlns:acat="https://schemas.acat.akademie.uni-bremen.de" id="1b27b43b-e8e1-45ca-a3e9-f6ac71a479af" field="157"/>
+              <acat:field xmlns:acat="https://schemas.acat.akademie.uni-bremen.de" id="a5a6cfbb-01d5-4768-91db-6e0c0daaed86" field="157"/>
             </w:r>
           </w:p>
         </w:tc>
@@ -1137,7 +1137,7 @@
               <w:rPr>
                 <w:rFonts w:ascii="Arial" w:hAnsi="Arial" w:cs="Arial"/>
               </w:rPr>
-              <acat:block xmlns:acat="https://schemas.acat.akademie.uni-bremen.de" id="fba2e821-ce9d-4f0d-bee3-9a04ed0ea42b" type="end"/>
+              <acat:block xmlns:acat="https://schemas.acat.akademie.uni-bremen.de" id="32ca459e-b24f-4dc8-bb55-692fc1d86528" type="end"/>
             </w:r>
           </w:p>
         </w:tc>
@@ -1868,7 +1868,7 @@
               <w:rPr>
                 <w:rFonts w:ascii="Arial" w:hAnsi="Arial" w:cs="Arial"/>
               </w:rPr>
-              <acat:block xmlns:acat="https://schemas.acat.akademie.uni-bremen.de" id="7103c718-7733-4065-b87c-462646247ec5" type="start"/>
+              <acat:block xmlns:acat="https://schemas.acat.akademie.uni-bremen.de" id="09f24c13-4bb6-4948-ae9b-776ce085218f" type="start"/>
             </w:r>
           </w:p>
         </w:tc>
@@ -1900,7 +1900,7 @@
               <w:rPr>
                 <w:rFonts w:ascii="Arial" w:hAnsi="Arial" w:cs="Arial"/>
               </w:rPr>
-              <acat:field xmlns:acat="https://schemas.acat.akademie.uni-bremen.de" id="29149a0c-4963-40df-807b-bc7f8dfa6940" field="156"/>
+              <acat:field xmlns:acat="https://schemas.acat.akademie.uni-bremen.de" id="8c1206d9-3183-4ecc-9e0f-7fa42750a1c8" field="156"/>
             </w:r>
           </w:p>
         </w:tc>
@@ -1918,7 +1918,7 @@
               <w:rPr>
                 <w:rFonts w:ascii="Arial" w:hAnsi="Arial" w:cs="Arial"/>
               </w:rPr>
-              <acat:field xmlns:acat="https://schemas.acat.akademie.uni-bremen.de" id="a3fbcfd5-2419-4d4c-b1fd-c9bddbc0e8f7" field="157"/>
+              <acat:field xmlns:acat="https://schemas.acat.akademie.uni-bremen.de" id="5e9256c1-961f-433e-8dee-04404345efb8" field="157"/>
             </w:r>
           </w:p>
         </w:tc>
@@ -1939,7 +1939,7 @@
                 <w:rFonts w:ascii="Arial" w:hAnsi="Arial" w:cs="Arial"/>
               </w:rPr>
               <w:lastRenderedPageBreak/>
-              <acat:block xmlns:acat="https://schemas.acat.akademie.uni-bremen.de" id="528d924c-0791-4bf2-bdd0-b5a80f36c53b" type="end"/>
+              <acat:block xmlns:acat="https://schemas.acat.akademie.uni-bremen.de" id="f10ad888-9533-4e05-b00f-78bf37ecf90f" type="end"/>
             </w:r>
           </w:p>
         </w:tc>
@@ -2354,7 +2354,7 @@
               <w:rPr>
                 <w:rFonts w:ascii="Arial" w:hAnsi="Arial" w:cs="Arial"/>
               </w:rPr>
-              <acat:block xmlns:acat="https://schemas.acat.akademie.uni-bremen.de" id="5d35742b-a998-4771-bdd1-316886e54d87" type="start"/>
+              <acat:block xmlns:acat="https://schemas.acat.akademie.uni-bremen.de" id="dc72f39b-e335-4ad1-af0e-bfb735ce68fb" type="start"/>
             </w:r>
           </w:p>
         </w:tc>
@@ -2392,7 +2392,7 @@
               <w:rPr>
                 <w:rFonts w:ascii="Arial" w:hAnsi="Arial" w:cs="Arial"/>
               </w:rPr>
-              <acat:field xmlns:acat="https://schemas.acat.akademie.uni-bremen.de" id="22f0c0df-f61b-4727-917e-e2e3f461c699" field="156"/>
+              <acat:field xmlns:acat="https://schemas.acat.akademie.uni-bremen.de" id="d9c82d91-b3a6-4c0b-adf8-db3ef6f487bf" field="156"/>
             </w:r>
           </w:p>
         </w:tc>
@@ -2410,7 +2410,7 @@
               <w:rPr>
                 <w:rFonts w:ascii="Arial" w:hAnsi="Arial" w:cs="Arial"/>
               </w:rPr>
-              <acat:field xmlns:acat="https://schemas.acat.akademie.uni-bremen.de" id="34ee3634-c01c-4605-bfed-5ca96dc67aaa" field="157"/>
+              <acat:field xmlns:acat="https://schemas.acat.akademie.uni-bremen.de" id="3039af2b-7e88-4f93-bf83-6b42c966fbce" field="157"/>
             </w:r>
           </w:p>
         </w:tc>
@@ -2430,7 +2430,7 @@
               <w:rPr>
                 <w:rFonts w:ascii="Arial" w:hAnsi="Arial" w:cs="Arial"/>
               </w:rPr>
-              <acat:block xmlns:acat="https://schemas.acat.akademie.uni-bremen.de" id="336cccf2-1839-48c6-b2a4-e91fe705e5ec" type="end"/>
+              <acat:block xmlns:acat="https://schemas.acat.akademie.uni-bremen.de" id="dd26dc28-38c2-46e7-99f6-fb9e7055a0a3" type="end"/>
             </w:r>
           </w:p>
         </w:tc>

</xml_diff>

<commit_message>
text and field render
</commit_message>
<xml_diff>
--- a/test/Parser/Tag/Resources/tag_generator_test_document_lck.docx
+++ b/test/Parser/Tag/Resources/tag_generator_test_document_lck.docx
@@ -89,7 +89,7 @@
           <w:color w:val="FF0000"/>
           <w:sz w:val="32"/>
         </w:rPr>
-        <acat:field xmlns:acat="https://schemas.acat.akademie.uni-bremen.de" id="dc494a80-defd-46bf-8ccc-25a7f63f344b" field="1121"/>
+        <acat:field xmlns:acat="https://schemas.acat.akademie.uni-bremen.de" id="1ddde988-25a4-444a-8a77-d813e202a78f" field="1121"/>
       </w:r>
     </w:p>
     <w:p>
@@ -136,9 +136,9 @@
         <w:rPr>
           <w:rFonts w:ascii="Trebuchet MS" w:hAnsi="Trebuchet MS"/>
         </w:rPr>
-        <acat:condition xmlns:acat="https://schemas.acat.akademie.uni-bremen.de" id="f38bf626-125e-45da-b30e-944bf29c282f" field="1760" action="0"><![CDATA[<>]]></acat:condition>
-        <acat:condition xmlns:acat="https://schemas.acat.akademie.uni-bremen.de" id="efce6555-18c0-42b1-b09c-ad70836dd3b7" field="1858" action="0"><![CDATA[=]]></acat:condition>
-        <acat:field xmlns:acat="https://schemas.acat.akademie.uni-bremen.de" id="ab87d1d1-4480-4e55-8b76-af9fff12471c" field="1858"/>
+        <acat:condition xmlns:acat="https://schemas.acat.akademie.uni-bremen.de" id="353ab3f2-f651-45b7-a08b-99eb02a18f49" field="1760" action="0"><![CDATA[<>]]></acat:condition>
+        <acat:condition xmlns:acat="https://schemas.acat.akademie.uni-bremen.de" id="571794de-c5d7-42b4-be90-14e09318e51a" field="1858" action="0"><![CDATA[=]]></acat:condition>
+        <acat:field xmlns:acat="https://schemas.acat.akademie.uni-bremen.de" id="f04a8c18-bebf-452f-aa0c-2a4b9b35e9aa" field="1858"/>
         <w:t xml:space="preserve"> </w:t>
       </w:r>
     </w:p>
@@ -154,9 +154,9 @@
         <w:rPr>
           <w:rFonts w:ascii="Trebuchet MS" w:hAnsi="Trebuchet MS"/>
         </w:rPr>
-        <acat:condition xmlns:acat="https://schemas.acat.akademie.uni-bremen.de" id="56600b12-38e6-4ab3-b3e0-a2c16e6dd5c0" field="1760" action="0"><![CDATA[<>]]></acat:condition>
-        <acat:condition xmlns:acat="https://schemas.acat.akademie.uni-bremen.de" id="7dd8960c-860e-4abe-ba4d-4b71a0c0eb23" field="1744" action="0"><![CDATA[=]]></acat:condition>
-        <acat:field xmlns:acat="https://schemas.acat.akademie.uni-bremen.de" id="516df63f-cb4a-4759-afbf-b0a4b4acc34e" field="1744"/>
+        <acat:condition xmlns:acat="https://schemas.acat.akademie.uni-bremen.de" id="2ee92153-5ec3-41d3-8fec-b7b4b4409677" field="1760" action="0"><![CDATA[<>]]></acat:condition>
+        <acat:condition xmlns:acat="https://schemas.acat.akademie.uni-bremen.de" id="0a25e43b-16d3-4617-847d-7fc905c23c77" field="1744" action="0"><![CDATA[=]]></acat:condition>
+        <acat:field xmlns:acat="https://schemas.acat.akademie.uni-bremen.de" id="dd4ef39e-a0db-432e-8542-7d32401d2646" field="1744"/>
       </w:r>
     </w:p>
     <w:p>
@@ -171,13 +171,13 @@
         <w:rPr>
           <w:rFonts w:ascii="Trebuchet MS" w:hAnsi="Trebuchet MS"/>
         </w:rPr>
-        <acat:condition xmlns:acat="https://schemas.acat.akademie.uni-bremen.de" id="0cef5ceb-5abc-4786-9cbe-2100a32a2c05" field="1760" action="0"><![CDATA[<>]]></acat:condition>
-        <acat:condition xmlns:acat="https://schemas.acat.akademie.uni-bremen.de" id="9aa513b3-6ad2-4d97-853d-84c18a11617e" field="1752" action="2"><![CDATA[=]]></acat:condition>
-        <acat:field xmlns:acat="https://schemas.acat.akademie.uni-bremen.de" id="bc7f11f5-f76e-402d-9ac6-0b5cda759b2f" field="1752"/>
+        <acat:condition xmlns:acat="https://schemas.acat.akademie.uni-bremen.de" id="9cc6eed4-2d64-47a4-be16-c114d956d061" field="1760" action="0"><![CDATA[<>]]></acat:condition>
+        <acat:condition xmlns:acat="https://schemas.acat.akademie.uni-bremen.de" id="541ee151-1455-4c4d-be54-1f895bbcccbe" field="1752" action="2"><![CDATA[=]]></acat:condition>
+        <acat:field xmlns:acat="https://schemas.acat.akademie.uni-bremen.de" id="436f661b-f87a-4f18-99d6-22fc93ca607c" field="1752"/>
         <w:t xml:space="preserve"> </w:t>
-        <acat:field xmlns:acat="https://schemas.acat.akademie.uni-bremen.de" id="38e0bcb1-d885-4b13-af8f-1a0495e685ba" field="1745"/>
+        <acat:field xmlns:acat="https://schemas.acat.akademie.uni-bremen.de" id="fa2dfa2c-29ac-41f4-b3b8-c58d1f2c311b" field="1745"/>
         <w:t xml:space="preserve"> </w:t>
-        <acat:field xmlns:acat="https://schemas.acat.akademie.uni-bremen.de" id="dc789418-1917-41c9-89ab-590b0f525c18" field="1747"/>
+        <acat:field xmlns:acat="https://schemas.acat.akademie.uni-bremen.de" id="c7b593c7-f61c-4537-970c-aebcafdab2e6" field="1747"/>
       </w:r>
     </w:p>
     <w:p>
@@ -192,8 +192,8 @@
         <w:rPr>
           <w:rFonts w:ascii="Trebuchet MS" w:hAnsi="Trebuchet MS"/>
         </w:rPr>
-        <acat:condition xmlns:acat="https://schemas.acat.akademie.uni-bremen.de" id="c730a6ba-0415-4dc6-a560-cd3f0921fe6d" field="1760" action="0"><![CDATA[<>]]></acat:condition>
-        <acat:field xmlns:acat="https://schemas.acat.akademie.uni-bremen.de" id="2c3f3654-a8bc-42a0-99a2-0192a42a6d71" field="1748"/>
+        <acat:condition xmlns:acat="https://schemas.acat.akademie.uni-bremen.de" id="27b692cb-793a-469d-9592-4dfa0b700a1d" field="1760" action="0"><![CDATA[<>]]></acat:condition>
+        <acat:field xmlns:acat="https://schemas.acat.akademie.uni-bremen.de" id="ab06907d-a8ca-4625-83bc-0decf4832441" field="1748"/>
       </w:r>
     </w:p>
     <w:p>
@@ -208,10 +208,10 @@
         <w:rPr>
           <w:rFonts w:ascii="Trebuchet MS" w:hAnsi="Trebuchet MS"/>
         </w:rPr>
-        <acat:condition xmlns:acat="https://schemas.acat.akademie.uni-bremen.de" id="6c509650-6fa2-4438-b803-5a088d2a09c1" field="1760" action="0"><![CDATA[<>]]></acat:condition>
-        <acat:field xmlns:acat="https://schemas.acat.akademie.uni-bremen.de" id="7ad06f2a-eef8-4d54-913a-2e94c5dd2c0f" field="1749"/>
+        <acat:condition xmlns:acat="https://schemas.acat.akademie.uni-bremen.de" id="376b9df5-6cc5-4b24-a45c-a6f8ac367126" field="1760" action="0"><![CDATA[<>]]></acat:condition>
+        <acat:field xmlns:acat="https://schemas.acat.akademie.uni-bremen.de" id="4f0c7096-4883-46dd-b1c1-81ea613c71a3" field="1749"/>
         <w:t xml:space="preserve"> </w:t>
-        <acat:field xmlns:acat="https://schemas.acat.akademie.uni-bremen.de" id="aba7dd47-ad7b-4fde-a22e-8fe1a8797078" field="1750"/>
+        <acat:field xmlns:acat="https://schemas.acat.akademie.uni-bremen.de" id="6011963d-fac2-451a-b5b1-2a264f10cae0" field="1750"/>
       </w:r>
     </w:p>
     <w:p>
@@ -226,8 +226,8 @@
         <w:rPr>
           <w:rFonts w:ascii="Trebuchet MS" w:hAnsi="Trebuchet MS"/>
         </w:rPr>
-        <acat:condition xmlns:acat="https://schemas.acat.akademie.uni-bremen.de" id="357e3fb3-625c-4cae-a4f0-694f0b4c86f9" field="1757" action="0"><![CDATA[=]]></acat:condition>
-        <acat:field xmlns:acat="https://schemas.acat.akademie.uni-bremen.de" id="f3e04a75-6f32-4d52-a1c4-8df8bd98077d" field="1757"/>
+        <acat:condition xmlns:acat="https://schemas.acat.akademie.uni-bremen.de" id="2ebc0df3-bd61-4bd6-bce2-06b76877cf52" field="1757" action="0"><![CDATA[=]]></acat:condition>
+        <acat:field xmlns:acat="https://schemas.acat.akademie.uni-bremen.de" id="0230c264-d5c8-4837-b161-9f77cab8cfbd" field="1757"/>
         <w:t xml:space="preserve"> </w:t>
       </w:r>
     </w:p>
@@ -243,8 +243,8 @@
         <w:rPr>
           <w:rFonts w:ascii="Trebuchet MS" w:hAnsi="Trebuchet MS"/>
         </w:rPr>
-        <acat:condition xmlns:acat="https://schemas.acat.akademie.uni-bremen.de" id="15723f97-bf85-42e4-bc62-a7be1674fcd0" field="1860" action="0"><![CDATA[=]]></acat:condition>
-        <acat:field xmlns:acat="https://schemas.acat.akademie.uni-bremen.de" id="6078f620-dfcc-44b6-9184-4195ff591636" field="1860"/>
+        <acat:condition xmlns:acat="https://schemas.acat.akademie.uni-bremen.de" id="d77d7b48-bb40-4e7f-aa81-f6f622f11e3e" field="1860" action="0"><![CDATA[=]]></acat:condition>
+        <acat:field xmlns:acat="https://schemas.acat.akademie.uni-bremen.de" id="51bf07cc-36cb-4e73-9aff-975d756f4406" field="1860"/>
         <w:t xml:space="preserve"> </w:t>
       </w:r>
     </w:p>
@@ -260,10 +260,10 @@
         <w:rPr>
           <w:rFonts w:ascii="Trebuchet MS" w:hAnsi="Trebuchet MS"/>
         </w:rPr>
-        <acat:condition xmlns:acat="https://schemas.acat.akademie.uni-bremen.de" id="c5f8c184-541b-4fd9-a08a-db5ef1fec585" field="1862" action="0"><![CDATA[=]]></acat:condition>
-        <acat:field xmlns:acat="https://schemas.acat.akademie.uni-bremen.de" id="81f12117-2a35-48d1-aedb-8a18dc522736" field="1862"/>
+        <acat:condition xmlns:acat="https://schemas.acat.akademie.uni-bremen.de" id="b44a9445-a996-45b6-81bd-d76162d04dfb" field="1862" action="0"><![CDATA[=]]></acat:condition>
+        <acat:field xmlns:acat="https://schemas.acat.akademie.uni-bremen.de" id="57c6a872-5119-49ee-94bb-7a10ba882c06" field="1862"/>
         <w:t xml:space="preserve"> </w:t>
-        <acat:field xmlns:acat="https://schemas.acat.akademie.uni-bremen.de" id="2ca37f34-2982-44f3-9941-25af82ac373a" field="1863"/>
+        <acat:field xmlns:acat="https://schemas.acat.akademie.uni-bremen.de" id="c2edf1cd-fcb0-4100-ac12-a9deb9660aa3" field="1863"/>
       </w:r>
     </w:p>
     <w:p>
@@ -278,8 +278,8 @@
         <w:rPr>
           <w:rFonts w:ascii="Trebuchet MS" w:hAnsi="Trebuchet MS"/>
         </w:rPr>
-        <acat:condition xmlns:acat="https://schemas.acat.akademie.uni-bremen.de" id="8536a091-956c-48e2-8e96-02337db4836b" field="1760" action="0"><![CDATA[=]]></acat:condition>
-        <acat:field xmlns:acat="https://schemas.acat.akademie.uni-bremen.de" id="9aa3741d-23f5-4742-8d64-45ece0d69c95" field="1760"/>
+        <acat:condition xmlns:acat="https://schemas.acat.akademie.uni-bremen.de" id="2c5ce727-cde7-47f6-b356-a6825bedb2f7" field="1760" action="0"><![CDATA[=]]></acat:condition>
+        <acat:field xmlns:acat="https://schemas.acat.akademie.uni-bremen.de" id="bd96d765-4538-4b22-a1a2-5c6de36f8032" field="1760"/>
       </w:r>
     </w:p>
     <w:p>
@@ -294,10 +294,10 @@
         <w:rPr>
           <w:rFonts w:ascii="Trebuchet MS" w:hAnsi="Trebuchet MS"/>
         </w:rPr>
-        <acat:condition xmlns:acat="https://schemas.acat.akademie.uni-bremen.de" id="f09462b1-5d39-4318-b525-007dea083234" field="1761" action="0"><![CDATA[=]]></acat:condition>
-        <acat:field xmlns:acat="https://schemas.acat.akademie.uni-bremen.de" id="4b62d7ff-5fb8-435d-979a-f828771d1292" field="1761"/>
+        <acat:condition xmlns:acat="https://schemas.acat.akademie.uni-bremen.de" id="c3c446b2-275e-48d8-80e7-7f9948aedfc8" field="1761" action="0"><![CDATA[=]]></acat:condition>
+        <acat:field xmlns:acat="https://schemas.acat.akademie.uni-bremen.de" id="013aa453-7562-4e79-aac2-a5db82ecd420" field="1761"/>
         <w:t xml:space="preserve"> </w:t>
-        <acat:field xmlns:acat="https://schemas.acat.akademie.uni-bremen.de" id="28185b3e-2ebe-4135-a289-f0cc24b4da5f" field="1762"/>
+        <acat:field xmlns:acat="https://schemas.acat.akademie.uni-bremen.de" id="37bb9904-67f3-4874-82ec-bb1ad5e20166" field="1762"/>
       </w:r>
     </w:p>
     <w:p>
@@ -326,7 +326,7 @@
         <w:rPr>
           <w:rFonts w:ascii="Trebuchet MS" w:hAnsi="Trebuchet MS"/>
         </w:rPr>
-        <acat:field xmlns:acat="https://schemas.acat.akademie.uni-bremen.de" id="74a6262f-5dbe-463e-922b-9d076afb5711" field="1858"/>
+        <acat:field xmlns:acat="https://schemas.acat.akademie.uni-bremen.de" id="7c885134-5eef-43ae-9202-85045d395238" field="1858"/>
       </w:r>
       <w:r>
         <w:rPr>
@@ -338,7 +338,7 @@
         <w:rPr>
           <w:rFonts w:ascii="Trebuchet MS" w:hAnsi="Trebuchet MS"/>
         </w:rPr>
-        <acat:field xmlns:acat="https://schemas.acat.akademie.uni-bremen.de" id="6c80a496-f7f3-46c3-8107-14b8574e2e22" field="1762"/>
+        <acat:field xmlns:acat="https://schemas.acat.akademie.uni-bremen.de" id="147c1c2b-1869-4d85-a577-1078afb9e44f" field="1762"/>
       </w:r>
       <w:r>
         <w:rPr>
@@ -350,16 +350,16 @@
         <w:rPr>
           <w:rFonts w:ascii="Trebuchet MS" w:hAnsi="Trebuchet MS"/>
         </w:rPr>
-        <acat:field xmlns:acat="https://schemas.acat.akademie.uni-bremen.de" id="118a7d5b-52d2-4d30-a78b-770bcb358704" field="1757"/>
+        <acat:field xmlns:acat="https://schemas.acat.akademie.uni-bremen.de" id="ea546fb7-6855-44b4-b4ed-ca88b567a8ac" field="1757"/>
       </w:r>
       <w:r>
         <w:rPr>
           <w:rFonts w:ascii="Trebuchet MS" w:hAnsi="Trebuchet MS"/>
         </w:rPr>
         <w:t xml:space="preserve"> Felder einbauen, sonst spiegelt das ja nicht wirklich die Realität wieder. Aber was wäre das Leben ohne die Möglichkeit Entscheidungen treffen zu können!? Deswegen </w:t>
-        <acat:condition xmlns:acat="https://schemas.acat.akademie.uni-bremen.de" id="d6bccbc1-ba87-47df-bb5b-c5cdb3add2c4" field="1760" action="0"><![CDATA[=]]></acat:condition>
+        <acat:condition xmlns:acat="https://schemas.acat.akademie.uni-bremen.de" id="a9de0492-46aa-4af6-9110-6875169dae27" field="1760" action="0"><![CDATA[=]]></acat:condition>
         <w:t xml:space="preserve"> </w:t>
-        <acat:text xmlns:acat="https://schemas.acat.akademie.uni-bremen.de" id="0590507b-08bc-40bd-aef7-1ead70f41c95" space="preserve">Hurray</acat:text>
+        <acat:text xmlns:acat="https://schemas.acat.akademie.uni-bremen.de" id="e89fa0e7-ed55-43a0-8ee5-e0667da3ce56" space="preserve">Hurray</acat:text>
         <w:t xml:space="preserve">. Läuft, oder!? :-P </w:t>
       </w:r>
       <w:proofErr w:type="spellStart"/>
@@ -397,7 +397,7 @@
         <w:rPr>
           <w:rFonts w:ascii="Trebuchet MS" w:hAnsi="Trebuchet MS"/>
         </w:rPr>
-        <acat:field xmlns:acat="https://schemas.acat.akademie.uni-bremen.de" id="5de69f46-d89c-4ecd-96fb-d07a6bf794ef" field="156"/>
+        <acat:field xmlns:acat="https://schemas.acat.akademie.uni-bremen.de" id="ab310e92-2f8e-4174-9e06-194688554fe8" field="156"/>
         <w:t xml:space="preserve"> Es soll das Feld mit der ID 156 gedruckt werden</w:t>
       </w:r>
     </w:p>
@@ -436,7 +436,7 @@
         <w:rPr>
           <w:rFonts w:ascii="Trebuchet MS" w:hAnsi="Trebuchet MS"/>
         </w:rPr>
-        <acat:text xmlns:acat="https://schemas.acat.akademie.uni-bremen.de" id="33f40b7b-74a4-40e3-a2a6-e5f5125928ed" space="preserve">FOO BAR</acat:text>
+        <acat:text xmlns:acat="https://schemas.acat.akademie.uni-bremen.de" id="bdf343b3-a6a9-4966-85e3-f149627c1243" space="preserve">FOO BAR</acat:text>
         <w:t xml:space="preserve"> Hier handelt es sich um ein Textfeld, welches den Inhalt „FOO BAR“ ausdruckt.</w:t>
       </w:r>
     </w:p>
@@ -506,7 +506,7 @@
         <w:rPr>
           <w:rFonts w:ascii="Arial" w:hAnsi="Arial" w:cs="Arial"/>
         </w:rPr>
-        <acat:block xmlns:acat="https://schemas.acat.akademie.uni-bremen.de" id="40f268bf-a0ff-4c60-9dc7-d20bab5e0abf" type="start"/>
+        <acat:block xmlns:acat="https://schemas.acat.akademie.uni-bremen.de" id="ced6f525-d6b4-41c9-b02c-45066890648a" type="start"/>
       </w:r>
     </w:p>
     <w:p>
@@ -520,20 +520,20 @@
         <w:rPr>
           <w:rFonts w:ascii="Arial" w:hAnsi="Arial" w:cs="Arial"/>
         </w:rPr>
-        <acat:field xmlns:acat="https://schemas.acat.akademie.uni-bremen.de" id="9b39242c-7790-4cb8-b897-c81682709ab6" field="156"/>
-      </w:r>
-    </w:p>
-    <w:p>
-      <w:pPr>
-        <w:rPr>
-          <w:rFonts w:ascii="Arial" w:hAnsi="Arial" w:cs="Arial"/>
-        </w:rPr>
-      </w:pPr>
-      <w:r>
-        <w:rPr>
-          <w:rFonts w:ascii="Arial" w:hAnsi="Arial" w:cs="Arial"/>
-        </w:rPr>
-        <acat:block xmlns:acat="https://schemas.acat.akademie.uni-bremen.de" id="a9a98a6d-e7a6-4ee6-a6cf-78c7ec894652" type="end"/>
+        <acat:field xmlns:acat="https://schemas.acat.akademie.uni-bremen.de" id="3bee2343-de79-4bb1-9bdb-fac5e9c232d0" field="156"/>
+      </w:r>
+    </w:p>
+    <w:p>
+      <w:pPr>
+        <w:rPr>
+          <w:rFonts w:ascii="Arial" w:hAnsi="Arial" w:cs="Arial"/>
+        </w:rPr>
+      </w:pPr>
+      <w:r>
+        <w:rPr>
+          <w:rFonts w:ascii="Arial" w:hAnsi="Arial" w:cs="Arial"/>
+        </w:rPr>
+        <acat:block xmlns:acat="https://schemas.acat.akademie.uni-bremen.de" id="dbdf2d0e-36d7-42c7-9f92-e19739d55592" type="end"/>
       </w:r>
     </w:p>
     <w:p>
@@ -633,11 +633,11 @@
         <w:rPr>
           <w:rFonts w:ascii="Arial" w:hAnsi="Arial" w:cs="Arial"/>
         </w:rPr>
-        <acat:block xmlns:acat="https://schemas.acat.akademie.uni-bremen.de" id="b34e64a5-6714-4653-8475-9a8d4270a00d" type="start"/>
+        <acat:block xmlns:acat="https://schemas.acat.akademie.uni-bremen.de" id="ba3543da-9c8c-4465-b6de-cb2817da5f4a" type="start"/>
         <w:t xml:space="preserve"> </w:t>
-        <acat:field xmlns:acat="https://schemas.acat.akademie.uni-bremen.de" id="69890673-57d9-44c1-b9b0-7429356acf76" field="157"/>
+        <acat:field xmlns:acat="https://schemas.acat.akademie.uni-bremen.de" id="64bec828-c0a8-4291-9d50-f73a11cd7036" field="157"/>
         <w:t xml:space="preserve"> </w:t>
-        <acat:block xmlns:acat="https://schemas.acat.akademie.uni-bremen.de" id="38c6d8d9-9733-4a4c-9b6c-2f6d49f78c93" type="end"/>
+        <acat:block xmlns:acat="https://schemas.acat.akademie.uni-bremen.de" id="7e1170e5-cc09-4633-ae3d-7c6ff8eecdd0" type="end"/>
       </w:r>
     </w:p>
     <w:p>
@@ -665,33 +665,33 @@
         <w:rPr>
           <w:rFonts w:ascii="Arial" w:hAnsi="Arial" w:cs="Arial"/>
         </w:rPr>
-        <acat:block xmlns:acat="https://schemas.acat.akademie.uni-bremen.de" id="42ca6575-fbce-4bfa-a711-7f58744d2a3e" type="start"/>
-      </w:r>
-    </w:p>
-    <w:p>
-      <w:pPr>
-        <w:rPr>
-          <w:rFonts w:ascii="Arial" w:hAnsi="Arial" w:cs="Arial"/>
-        </w:rPr>
-      </w:pPr>
-      <w:r>
-        <w:rPr>
-          <w:rFonts w:ascii="Arial" w:hAnsi="Arial" w:cs="Arial"/>
-        </w:rPr>
-        <acat:field xmlns:acat="https://schemas.acat.akademie.uni-bremen.de" id="4b8d426b-d266-4b84-ae5f-cb9c51b9367b" field="156"/>
-      </w:r>
-    </w:p>
-    <w:p>
-      <w:pPr>
-        <w:rPr>
-          <w:rFonts w:ascii="Arial" w:hAnsi="Arial" w:cs="Arial"/>
-        </w:rPr>
-      </w:pPr>
-      <w:r>
-        <w:rPr>
-          <w:rFonts w:ascii="Arial" w:hAnsi="Arial" w:cs="Arial"/>
-        </w:rPr>
-        <acat:block xmlns:acat="https://schemas.acat.akademie.uni-bremen.de" id="55591655-34e7-4280-bdb7-7c1280c741b5" type="end"/>
+        <acat:block xmlns:acat="https://schemas.acat.akademie.uni-bremen.de" id="a711f04a-8781-4a06-b430-07ee066552bf" type="start"/>
+      </w:r>
+    </w:p>
+    <w:p>
+      <w:pPr>
+        <w:rPr>
+          <w:rFonts w:ascii="Arial" w:hAnsi="Arial" w:cs="Arial"/>
+        </w:rPr>
+      </w:pPr>
+      <w:r>
+        <w:rPr>
+          <w:rFonts w:ascii="Arial" w:hAnsi="Arial" w:cs="Arial"/>
+        </w:rPr>
+        <acat:field xmlns:acat="https://schemas.acat.akademie.uni-bremen.de" id="b3e70d92-618c-4501-bdc3-f0e64d62514a" field="156"/>
+      </w:r>
+    </w:p>
+    <w:p>
+      <w:pPr>
+        <w:rPr>
+          <w:rFonts w:ascii="Arial" w:hAnsi="Arial" w:cs="Arial"/>
+        </w:rPr>
+      </w:pPr>
+      <w:r>
+        <w:rPr>
+          <w:rFonts w:ascii="Arial" w:hAnsi="Arial" w:cs="Arial"/>
+        </w:rPr>
+        <acat:block xmlns:acat="https://schemas.acat.akademie.uni-bremen.de" id="b9cca9fb-ea58-40e1-9e6b-471615c525aa" type="end"/>
       </w:r>
     </w:p>
     <w:p>
@@ -1082,7 +1082,7 @@
               <w:rPr>
                 <w:rFonts w:ascii="Arial" w:hAnsi="Arial" w:cs="Arial"/>
               </w:rPr>
-              <acat:block xmlns:acat="https://schemas.acat.akademie.uni-bremen.de" id="60be7fad-d004-41ef-99ae-9565bd5ec2b5" type="start"/>
+              <acat:block xmlns:acat="https://schemas.acat.akademie.uni-bremen.de" id="82e71ce6-7200-4c84-9b97-e3cc8238940e" type="start"/>
               <w:t xml:space="preserve"> </w:t>
             </w:r>
           </w:p>
@@ -1101,7 +1101,7 @@
               <w:rPr>
                 <w:rFonts w:ascii="Arial" w:hAnsi="Arial" w:cs="Arial"/>
               </w:rPr>
-              <acat:field xmlns:acat="https://schemas.acat.akademie.uni-bremen.de" id="fe6e9d90-2902-4120-8194-a9d38f17438c" field="156"/>
+              <acat:field xmlns:acat="https://schemas.acat.akademie.uni-bremen.de" id="09192af0-9a82-41e2-b579-6c75a71331f1" field="156"/>
             </w:r>
           </w:p>
         </w:tc>
@@ -1119,7 +1119,7 @@
               <w:rPr>
                 <w:rFonts w:ascii="Arial" w:hAnsi="Arial" w:cs="Arial"/>
               </w:rPr>
-              <acat:field xmlns:acat="https://schemas.acat.akademie.uni-bremen.de" id="a5a6cfbb-01d5-4768-91db-6e0c0daaed86" field="157"/>
+              <acat:field xmlns:acat="https://schemas.acat.akademie.uni-bremen.de" id="66d73939-e413-46eb-ae67-989b385b3f4c" field="157"/>
             </w:r>
           </w:p>
         </w:tc>
@@ -1137,7 +1137,7 @@
               <w:rPr>
                 <w:rFonts w:ascii="Arial" w:hAnsi="Arial" w:cs="Arial"/>
               </w:rPr>
-              <acat:block xmlns:acat="https://schemas.acat.akademie.uni-bremen.de" id="32ca459e-b24f-4dc8-bb55-692fc1d86528" type="end"/>
+              <acat:block xmlns:acat="https://schemas.acat.akademie.uni-bremen.de" id="7e60c755-aec8-423b-bdac-9622924d002c" type="end"/>
             </w:r>
           </w:p>
         </w:tc>
@@ -1868,7 +1868,7 @@
               <w:rPr>
                 <w:rFonts w:ascii="Arial" w:hAnsi="Arial" w:cs="Arial"/>
               </w:rPr>
-              <acat:block xmlns:acat="https://schemas.acat.akademie.uni-bremen.de" id="09f24c13-4bb6-4948-ae9b-776ce085218f" type="start"/>
+              <acat:block xmlns:acat="https://schemas.acat.akademie.uni-bremen.de" id="1aaf0134-2890-4a69-ab47-e85f30332372" type="start"/>
             </w:r>
           </w:p>
         </w:tc>
@@ -1900,7 +1900,7 @@
               <w:rPr>
                 <w:rFonts w:ascii="Arial" w:hAnsi="Arial" w:cs="Arial"/>
               </w:rPr>
-              <acat:field xmlns:acat="https://schemas.acat.akademie.uni-bremen.de" id="8c1206d9-3183-4ecc-9e0f-7fa42750a1c8" field="156"/>
+              <acat:field xmlns:acat="https://schemas.acat.akademie.uni-bremen.de" id="888ddb32-9637-4470-9e38-f3709a8980e7" field="156"/>
             </w:r>
           </w:p>
         </w:tc>
@@ -1918,7 +1918,7 @@
               <w:rPr>
                 <w:rFonts w:ascii="Arial" w:hAnsi="Arial" w:cs="Arial"/>
               </w:rPr>
-              <acat:field xmlns:acat="https://schemas.acat.akademie.uni-bremen.de" id="5e9256c1-961f-433e-8dee-04404345efb8" field="157"/>
+              <acat:field xmlns:acat="https://schemas.acat.akademie.uni-bremen.de" id="38286af1-bf9d-43d3-828d-3b7f316e2493" field="157"/>
             </w:r>
           </w:p>
         </w:tc>
@@ -1939,7 +1939,7 @@
                 <w:rFonts w:ascii="Arial" w:hAnsi="Arial" w:cs="Arial"/>
               </w:rPr>
               <w:lastRenderedPageBreak/>
-              <acat:block xmlns:acat="https://schemas.acat.akademie.uni-bremen.de" id="f10ad888-9533-4e05-b00f-78bf37ecf90f" type="end"/>
+              <acat:block xmlns:acat="https://schemas.acat.akademie.uni-bremen.de" id="9bc26fec-97c3-4b93-8893-ef789623c389" type="end"/>
             </w:r>
           </w:p>
         </w:tc>
@@ -2354,7 +2354,7 @@
               <w:rPr>
                 <w:rFonts w:ascii="Arial" w:hAnsi="Arial" w:cs="Arial"/>
               </w:rPr>
-              <acat:block xmlns:acat="https://schemas.acat.akademie.uni-bremen.de" id="dc72f39b-e335-4ad1-af0e-bfb735ce68fb" type="start"/>
+              <acat:block xmlns:acat="https://schemas.acat.akademie.uni-bremen.de" id="435da7de-af2f-4592-9dd0-7c12cdc5a997" type="start"/>
             </w:r>
           </w:p>
         </w:tc>
@@ -2392,7 +2392,7 @@
               <w:rPr>
                 <w:rFonts w:ascii="Arial" w:hAnsi="Arial" w:cs="Arial"/>
               </w:rPr>
-              <acat:field xmlns:acat="https://schemas.acat.akademie.uni-bremen.de" id="d9c82d91-b3a6-4c0b-adf8-db3ef6f487bf" field="156"/>
+              <acat:field xmlns:acat="https://schemas.acat.akademie.uni-bremen.de" id="d7019c31-0077-4f8d-9413-98ecc4e2378c" field="156"/>
             </w:r>
           </w:p>
         </w:tc>
@@ -2410,7 +2410,7 @@
               <w:rPr>
                 <w:rFonts w:ascii="Arial" w:hAnsi="Arial" w:cs="Arial"/>
               </w:rPr>
-              <acat:field xmlns:acat="https://schemas.acat.akademie.uni-bremen.de" id="3039af2b-7e88-4f93-bf83-6b42c966fbce" field="157"/>
+              <acat:field xmlns:acat="https://schemas.acat.akademie.uni-bremen.de" id="da65b802-63d3-4cdc-87e5-49f99067e9e8" field="157"/>
             </w:r>
           </w:p>
         </w:tc>
@@ -2430,7 +2430,7 @@
               <w:rPr>
                 <w:rFonts w:ascii="Arial" w:hAnsi="Arial" w:cs="Arial"/>
               </w:rPr>
-              <acat:block xmlns:acat="https://schemas.acat.akademie.uni-bremen.de" id="dd26dc28-38c2-46e7-99f6-fb9e7055a0a3" type="end"/>
+              <acat:block xmlns:acat="https://schemas.acat.akademie.uni-bremen.de" id="c51e6e50-60cc-482a-b8d8-0cac13a0fbc7" type="end"/>
             </w:r>
           </w:p>
         </w:tc>

</xml_diff>

<commit_message>
condition and block renderer
</commit_message>
<xml_diff>
--- a/test/Parser/Tag/Resources/tag_generator_test_document_lck.docx
+++ b/test/Parser/Tag/Resources/tag_generator_test_document_lck.docx
@@ -89,7 +89,7 @@
           <w:color w:val="FF0000"/>
           <w:sz w:val="32"/>
         </w:rPr>
-        <acat:field xmlns:acat="https://schemas.acat.akademie.uni-bremen.de" id="1ddde988-25a4-444a-8a77-d813e202a78f" field="1121"/>
+        <acat:field xmlns:acat="https://schemas.acat.akademie.uni-bremen.de" id="0df001e6-c8e7-418d-b6d7-a2e0e40b46c3" field="1121"/>
       </w:r>
     </w:p>
     <w:p>
@@ -136,9 +136,9 @@
         <w:rPr>
           <w:rFonts w:ascii="Trebuchet MS" w:hAnsi="Trebuchet MS"/>
         </w:rPr>
-        <acat:condition xmlns:acat="https://schemas.acat.akademie.uni-bremen.de" id="353ab3f2-f651-45b7-a08b-99eb02a18f49" field="1760" action="0"><![CDATA[<>]]></acat:condition>
-        <acat:condition xmlns:acat="https://schemas.acat.akademie.uni-bremen.de" id="571794de-c5d7-42b4-be90-14e09318e51a" field="1858" action="0"><![CDATA[=]]></acat:condition>
-        <acat:field xmlns:acat="https://schemas.acat.akademie.uni-bremen.de" id="f04a8c18-bebf-452f-aa0c-2a4b9b35e9aa" field="1858"/>
+        <acat:condition xmlns:acat="https://schemas.acat.akademie.uni-bremen.de" id="eb75eaaa-2364-491f-bcf4-d7dedab9a1f1" field="1760" action="0"><![CDATA[<>]]></acat:condition>
+        <acat:condition xmlns:acat="https://schemas.acat.akademie.uni-bremen.de" id="544d508d-53da-4e51-973c-3cc10c62810a" field="1858" action="0"><![CDATA[=]]></acat:condition>
+        <acat:field xmlns:acat="https://schemas.acat.akademie.uni-bremen.de" id="4fb0000d-25a8-49da-bd09-a3d701bcc42b" field="1858"/>
         <w:t xml:space="preserve"> </w:t>
       </w:r>
     </w:p>
@@ -154,9 +154,9 @@
         <w:rPr>
           <w:rFonts w:ascii="Trebuchet MS" w:hAnsi="Trebuchet MS"/>
         </w:rPr>
-        <acat:condition xmlns:acat="https://schemas.acat.akademie.uni-bremen.de" id="2ee92153-5ec3-41d3-8fec-b7b4b4409677" field="1760" action="0"><![CDATA[<>]]></acat:condition>
-        <acat:condition xmlns:acat="https://schemas.acat.akademie.uni-bremen.de" id="0a25e43b-16d3-4617-847d-7fc905c23c77" field="1744" action="0"><![CDATA[=]]></acat:condition>
-        <acat:field xmlns:acat="https://schemas.acat.akademie.uni-bremen.de" id="dd4ef39e-a0db-432e-8542-7d32401d2646" field="1744"/>
+        <acat:condition xmlns:acat="https://schemas.acat.akademie.uni-bremen.de" id="efb2de04-ddce-4c5f-ade8-8cc27936aab0" field="1760" action="0"><![CDATA[<>]]></acat:condition>
+        <acat:condition xmlns:acat="https://schemas.acat.akademie.uni-bremen.de" id="90df1cce-4fa2-421d-a764-0d59b1e7648d" field="1744" action="0"><![CDATA[=]]></acat:condition>
+        <acat:field xmlns:acat="https://schemas.acat.akademie.uni-bremen.de" id="697c7fa2-cd20-46cb-8fe5-e112d19971f6" field="1744"/>
       </w:r>
     </w:p>
     <w:p>
@@ -171,13 +171,13 @@
         <w:rPr>
           <w:rFonts w:ascii="Trebuchet MS" w:hAnsi="Trebuchet MS"/>
         </w:rPr>
-        <acat:condition xmlns:acat="https://schemas.acat.akademie.uni-bremen.de" id="9cc6eed4-2d64-47a4-be16-c114d956d061" field="1760" action="0"><![CDATA[<>]]></acat:condition>
-        <acat:condition xmlns:acat="https://schemas.acat.akademie.uni-bremen.de" id="541ee151-1455-4c4d-be54-1f895bbcccbe" field="1752" action="2"><![CDATA[=]]></acat:condition>
-        <acat:field xmlns:acat="https://schemas.acat.akademie.uni-bremen.de" id="436f661b-f87a-4f18-99d6-22fc93ca607c" field="1752"/>
+        <acat:condition xmlns:acat="https://schemas.acat.akademie.uni-bremen.de" id="10e45ea2-9b4f-4a10-afd1-e3f511176a41" field="1760" action="0"><![CDATA[<>]]></acat:condition>
+        <acat:condition xmlns:acat="https://schemas.acat.akademie.uni-bremen.de" id="1aa7a0ac-b6f6-4047-837d-f07ca19e90ff" field="1752" action="2"><![CDATA[=]]></acat:condition>
+        <acat:field xmlns:acat="https://schemas.acat.akademie.uni-bremen.de" id="e4ff2f4b-7dda-4721-a110-34a021c508e7" field="1752"/>
         <w:t xml:space="preserve"> </w:t>
-        <acat:field xmlns:acat="https://schemas.acat.akademie.uni-bremen.de" id="fa2dfa2c-29ac-41f4-b3b8-c58d1f2c311b" field="1745"/>
+        <acat:field xmlns:acat="https://schemas.acat.akademie.uni-bremen.de" id="a14d7f1b-5f0a-4b48-9a38-0598d0bf804f" field="1745"/>
         <w:t xml:space="preserve"> </w:t>
-        <acat:field xmlns:acat="https://schemas.acat.akademie.uni-bremen.de" id="c7b593c7-f61c-4537-970c-aebcafdab2e6" field="1747"/>
+        <acat:field xmlns:acat="https://schemas.acat.akademie.uni-bremen.de" id="0af33200-dd13-4d3a-9cfa-decf28184bc0" field="1747"/>
       </w:r>
     </w:p>
     <w:p>
@@ -192,8 +192,8 @@
         <w:rPr>
           <w:rFonts w:ascii="Trebuchet MS" w:hAnsi="Trebuchet MS"/>
         </w:rPr>
-        <acat:condition xmlns:acat="https://schemas.acat.akademie.uni-bremen.de" id="27b692cb-793a-469d-9592-4dfa0b700a1d" field="1760" action="0"><![CDATA[<>]]></acat:condition>
-        <acat:field xmlns:acat="https://schemas.acat.akademie.uni-bremen.de" id="ab06907d-a8ca-4625-83bc-0decf4832441" field="1748"/>
+        <acat:condition xmlns:acat="https://schemas.acat.akademie.uni-bremen.de" id="f80cc709-5692-4d4d-99c5-d753e9a9adf6" field="1760" action="0"><![CDATA[<>]]></acat:condition>
+        <acat:field xmlns:acat="https://schemas.acat.akademie.uni-bremen.de" id="6595f274-e5cb-450a-80a7-4afe94e8c3e6" field="1748"/>
       </w:r>
     </w:p>
     <w:p>
@@ -208,10 +208,10 @@
         <w:rPr>
           <w:rFonts w:ascii="Trebuchet MS" w:hAnsi="Trebuchet MS"/>
         </w:rPr>
-        <acat:condition xmlns:acat="https://schemas.acat.akademie.uni-bremen.de" id="376b9df5-6cc5-4b24-a45c-a6f8ac367126" field="1760" action="0"><![CDATA[<>]]></acat:condition>
-        <acat:field xmlns:acat="https://schemas.acat.akademie.uni-bremen.de" id="4f0c7096-4883-46dd-b1c1-81ea613c71a3" field="1749"/>
+        <acat:condition xmlns:acat="https://schemas.acat.akademie.uni-bremen.de" id="d9fd61dd-255a-4c7b-af5d-ae16b6fb59c8" field="1760" action="0"><![CDATA[<>]]></acat:condition>
+        <acat:field xmlns:acat="https://schemas.acat.akademie.uni-bremen.de" id="93c25b62-1c7d-4f09-abac-49ce428115ce" field="1749"/>
         <w:t xml:space="preserve"> </w:t>
-        <acat:field xmlns:acat="https://schemas.acat.akademie.uni-bremen.de" id="6011963d-fac2-451a-b5b1-2a264f10cae0" field="1750"/>
+        <acat:field xmlns:acat="https://schemas.acat.akademie.uni-bremen.de" id="66e00368-4d17-4f28-a898-20a270647f42" field="1750"/>
       </w:r>
     </w:p>
     <w:p>
@@ -226,8 +226,8 @@
         <w:rPr>
           <w:rFonts w:ascii="Trebuchet MS" w:hAnsi="Trebuchet MS"/>
         </w:rPr>
-        <acat:condition xmlns:acat="https://schemas.acat.akademie.uni-bremen.de" id="2ebc0df3-bd61-4bd6-bce2-06b76877cf52" field="1757" action="0"><![CDATA[=]]></acat:condition>
-        <acat:field xmlns:acat="https://schemas.acat.akademie.uni-bremen.de" id="0230c264-d5c8-4837-b161-9f77cab8cfbd" field="1757"/>
+        <acat:condition xmlns:acat="https://schemas.acat.akademie.uni-bremen.de" id="d6075c4a-db71-4500-a32b-6a8cca501985" field="1757" action="0"><![CDATA[=]]></acat:condition>
+        <acat:field xmlns:acat="https://schemas.acat.akademie.uni-bremen.de" id="dd849473-e232-4533-bbd9-991b362c7c53" field="1757"/>
         <w:t xml:space="preserve"> </w:t>
       </w:r>
     </w:p>
@@ -243,8 +243,8 @@
         <w:rPr>
           <w:rFonts w:ascii="Trebuchet MS" w:hAnsi="Trebuchet MS"/>
         </w:rPr>
-        <acat:condition xmlns:acat="https://schemas.acat.akademie.uni-bremen.de" id="d77d7b48-bb40-4e7f-aa81-f6f622f11e3e" field="1860" action="0"><![CDATA[=]]></acat:condition>
-        <acat:field xmlns:acat="https://schemas.acat.akademie.uni-bremen.de" id="51bf07cc-36cb-4e73-9aff-975d756f4406" field="1860"/>
+        <acat:condition xmlns:acat="https://schemas.acat.akademie.uni-bremen.de" id="69c87e25-e761-41ab-ab81-fbfb033eaafb" field="1860" action="0"><![CDATA[=]]></acat:condition>
+        <acat:field xmlns:acat="https://schemas.acat.akademie.uni-bremen.de" id="3a78bfaf-7779-4f5d-b31e-dd50bc75e0be" field="1860"/>
         <w:t xml:space="preserve"> </w:t>
       </w:r>
     </w:p>
@@ -260,10 +260,10 @@
         <w:rPr>
           <w:rFonts w:ascii="Trebuchet MS" w:hAnsi="Trebuchet MS"/>
         </w:rPr>
-        <acat:condition xmlns:acat="https://schemas.acat.akademie.uni-bremen.de" id="b44a9445-a996-45b6-81bd-d76162d04dfb" field="1862" action="0"><![CDATA[=]]></acat:condition>
-        <acat:field xmlns:acat="https://schemas.acat.akademie.uni-bremen.de" id="57c6a872-5119-49ee-94bb-7a10ba882c06" field="1862"/>
+        <acat:condition xmlns:acat="https://schemas.acat.akademie.uni-bremen.de" id="f2ab5e6a-d7db-4566-bb3a-1024f26179e2" field="1862" action="0"><![CDATA[=]]></acat:condition>
+        <acat:field xmlns:acat="https://schemas.acat.akademie.uni-bremen.de" id="27a71bf1-0bad-4324-a666-a8ac644297ba" field="1862"/>
         <w:t xml:space="preserve"> </w:t>
-        <acat:field xmlns:acat="https://schemas.acat.akademie.uni-bremen.de" id="c2edf1cd-fcb0-4100-ac12-a9deb9660aa3" field="1863"/>
+        <acat:field xmlns:acat="https://schemas.acat.akademie.uni-bremen.de" id="27e2315c-4628-43f0-8d49-134fbd0a9aea" field="1863"/>
       </w:r>
     </w:p>
     <w:p>
@@ -278,8 +278,8 @@
         <w:rPr>
           <w:rFonts w:ascii="Trebuchet MS" w:hAnsi="Trebuchet MS"/>
         </w:rPr>
-        <acat:condition xmlns:acat="https://schemas.acat.akademie.uni-bremen.de" id="2c5ce727-cde7-47f6-b356-a6825bedb2f7" field="1760" action="0"><![CDATA[=]]></acat:condition>
-        <acat:field xmlns:acat="https://schemas.acat.akademie.uni-bremen.de" id="bd96d765-4538-4b22-a1a2-5c6de36f8032" field="1760"/>
+        <acat:condition xmlns:acat="https://schemas.acat.akademie.uni-bremen.de" id="d47e926d-b645-4bda-8f39-8c04b8baa3ad" field="1760" action="0"><![CDATA[=]]></acat:condition>
+        <acat:field xmlns:acat="https://schemas.acat.akademie.uni-bremen.de" id="c98bedb7-9730-467f-ab5b-e5d6b50902b5" field="1760"/>
       </w:r>
     </w:p>
     <w:p>
@@ -294,10 +294,10 @@
         <w:rPr>
           <w:rFonts w:ascii="Trebuchet MS" w:hAnsi="Trebuchet MS"/>
         </w:rPr>
-        <acat:condition xmlns:acat="https://schemas.acat.akademie.uni-bremen.de" id="c3c446b2-275e-48d8-80e7-7f9948aedfc8" field="1761" action="0"><![CDATA[=]]></acat:condition>
-        <acat:field xmlns:acat="https://schemas.acat.akademie.uni-bremen.de" id="013aa453-7562-4e79-aac2-a5db82ecd420" field="1761"/>
+        <acat:condition xmlns:acat="https://schemas.acat.akademie.uni-bremen.de" id="7c58e13b-3ae1-4e9d-9b12-65cd8fc6c34e" field="1761" action="0"><![CDATA[=]]></acat:condition>
+        <acat:field xmlns:acat="https://schemas.acat.akademie.uni-bremen.de" id="5d3156eb-bce5-4a6a-a93d-d59a176cd10c" field="1761"/>
         <w:t xml:space="preserve"> </w:t>
-        <acat:field xmlns:acat="https://schemas.acat.akademie.uni-bremen.de" id="37bb9904-67f3-4874-82ec-bb1ad5e20166" field="1762"/>
+        <acat:field xmlns:acat="https://schemas.acat.akademie.uni-bremen.de" id="ed0815dd-c44a-45ae-bef0-643d7d8d1a94" field="1762"/>
       </w:r>
     </w:p>
     <w:p>
@@ -326,7 +326,7 @@
         <w:rPr>
           <w:rFonts w:ascii="Trebuchet MS" w:hAnsi="Trebuchet MS"/>
         </w:rPr>
-        <acat:field xmlns:acat="https://schemas.acat.akademie.uni-bremen.de" id="7c885134-5eef-43ae-9202-85045d395238" field="1858"/>
+        <acat:field xmlns:acat="https://schemas.acat.akademie.uni-bremen.de" id="c4873b8e-e2f9-45c9-a292-1443aac63211" field="1858"/>
       </w:r>
       <w:r>
         <w:rPr>
@@ -338,7 +338,7 @@
         <w:rPr>
           <w:rFonts w:ascii="Trebuchet MS" w:hAnsi="Trebuchet MS"/>
         </w:rPr>
-        <acat:field xmlns:acat="https://schemas.acat.akademie.uni-bremen.de" id="147c1c2b-1869-4d85-a577-1078afb9e44f" field="1762"/>
+        <acat:field xmlns:acat="https://schemas.acat.akademie.uni-bremen.de" id="b9f70ba8-e68a-4fea-86bd-f7333f38cd43" field="1762"/>
       </w:r>
       <w:r>
         <w:rPr>
@@ -350,16 +350,16 @@
         <w:rPr>
           <w:rFonts w:ascii="Trebuchet MS" w:hAnsi="Trebuchet MS"/>
         </w:rPr>
-        <acat:field xmlns:acat="https://schemas.acat.akademie.uni-bremen.de" id="ea546fb7-6855-44b4-b4ed-ca88b567a8ac" field="1757"/>
+        <acat:field xmlns:acat="https://schemas.acat.akademie.uni-bremen.de" id="b6efa3cd-5cd8-44c5-ac43-43a0764b697b" field="1757"/>
       </w:r>
       <w:r>
         <w:rPr>
           <w:rFonts w:ascii="Trebuchet MS" w:hAnsi="Trebuchet MS"/>
         </w:rPr>
         <w:t xml:space="preserve"> Felder einbauen, sonst spiegelt das ja nicht wirklich die Realität wieder. Aber was wäre das Leben ohne die Möglichkeit Entscheidungen treffen zu können!? Deswegen </w:t>
-        <acat:condition xmlns:acat="https://schemas.acat.akademie.uni-bremen.de" id="a9de0492-46aa-4af6-9110-6875169dae27" field="1760" action="0"><![CDATA[=]]></acat:condition>
+        <acat:condition xmlns:acat="https://schemas.acat.akademie.uni-bremen.de" id="49317eaa-53c1-4d1d-9d68-ad915790cbcf" field="1760" action="0"><![CDATA[=]]></acat:condition>
         <w:t xml:space="preserve"> </w:t>
-        <acat:text xmlns:acat="https://schemas.acat.akademie.uni-bremen.de" id="e89fa0e7-ed55-43a0-8ee5-e0667da3ce56" space="preserve">Hurray</acat:text>
+        <acat:text xmlns:acat="https://schemas.acat.akademie.uni-bremen.de" id="e4bd4aac-1765-4942-80df-ccbb7bbe3505" space="preserve">Hurray</acat:text>
         <w:t xml:space="preserve">. Läuft, oder!? :-P </w:t>
       </w:r>
       <w:proofErr w:type="spellStart"/>
@@ -397,7 +397,7 @@
         <w:rPr>
           <w:rFonts w:ascii="Trebuchet MS" w:hAnsi="Trebuchet MS"/>
         </w:rPr>
-        <acat:field xmlns:acat="https://schemas.acat.akademie.uni-bremen.de" id="ab310e92-2f8e-4174-9e06-194688554fe8" field="156"/>
+        <acat:field xmlns:acat="https://schemas.acat.akademie.uni-bremen.de" id="6b983ed2-0f27-4085-bd40-91d73453fe84" field="156"/>
         <w:t xml:space="preserve"> Es soll das Feld mit der ID 156 gedruckt werden</w:t>
       </w:r>
     </w:p>
@@ -436,7 +436,7 @@
         <w:rPr>
           <w:rFonts w:ascii="Trebuchet MS" w:hAnsi="Trebuchet MS"/>
         </w:rPr>
-        <acat:text xmlns:acat="https://schemas.acat.akademie.uni-bremen.de" id="bdf343b3-a6a9-4966-85e3-f149627c1243" space="preserve">FOO BAR</acat:text>
+        <acat:text xmlns:acat="https://schemas.acat.akademie.uni-bremen.de" id="8d0f6abc-53e6-4cb4-82f7-bcde4121436e" space="preserve">FOO BAR</acat:text>
         <w:t xml:space="preserve"> Hier handelt es sich um ein Textfeld, welches den Inhalt „FOO BAR“ ausdruckt.</w:t>
       </w:r>
     </w:p>
@@ -506,7 +506,7 @@
         <w:rPr>
           <w:rFonts w:ascii="Arial" w:hAnsi="Arial" w:cs="Arial"/>
         </w:rPr>
-        <acat:block xmlns:acat="https://schemas.acat.akademie.uni-bremen.de" id="ced6f525-d6b4-41c9-b02c-45066890648a" type="start"/>
+        <acat:block xmlns:acat="https://schemas.acat.akademie.uni-bremen.de" id="68223c59-e1cf-407c-9cf7-d6c096b84758" type="start"/>
       </w:r>
     </w:p>
     <w:p>
@@ -520,20 +520,20 @@
         <w:rPr>
           <w:rFonts w:ascii="Arial" w:hAnsi="Arial" w:cs="Arial"/>
         </w:rPr>
-        <acat:field xmlns:acat="https://schemas.acat.akademie.uni-bremen.de" id="3bee2343-de79-4bb1-9bdb-fac5e9c232d0" field="156"/>
-      </w:r>
-    </w:p>
-    <w:p>
-      <w:pPr>
-        <w:rPr>
-          <w:rFonts w:ascii="Arial" w:hAnsi="Arial" w:cs="Arial"/>
-        </w:rPr>
-      </w:pPr>
-      <w:r>
-        <w:rPr>
-          <w:rFonts w:ascii="Arial" w:hAnsi="Arial" w:cs="Arial"/>
-        </w:rPr>
-        <acat:block xmlns:acat="https://schemas.acat.akademie.uni-bremen.de" id="dbdf2d0e-36d7-42c7-9f92-e19739d55592" type="end"/>
+        <acat:field xmlns:acat="https://schemas.acat.akademie.uni-bremen.de" id="9051875a-7756-4e02-b9aa-4be1d1ffba19" field="156"/>
+      </w:r>
+    </w:p>
+    <w:p>
+      <w:pPr>
+        <w:rPr>
+          <w:rFonts w:ascii="Arial" w:hAnsi="Arial" w:cs="Arial"/>
+        </w:rPr>
+      </w:pPr>
+      <w:r>
+        <w:rPr>
+          <w:rFonts w:ascii="Arial" w:hAnsi="Arial" w:cs="Arial"/>
+        </w:rPr>
+        <acat:block xmlns:acat="https://schemas.acat.akademie.uni-bremen.de" id="ff6cf1c9-b5dd-4284-bbe0-501a876c93de" type="end"/>
       </w:r>
     </w:p>
     <w:p>
@@ -633,11 +633,11 @@
         <w:rPr>
           <w:rFonts w:ascii="Arial" w:hAnsi="Arial" w:cs="Arial"/>
         </w:rPr>
-        <acat:block xmlns:acat="https://schemas.acat.akademie.uni-bremen.de" id="ba3543da-9c8c-4465-b6de-cb2817da5f4a" type="start"/>
+        <acat:block xmlns:acat="https://schemas.acat.akademie.uni-bremen.de" id="f68735fd-f78e-463d-b4c4-4a0b9999a72d" type="start"/>
         <w:t xml:space="preserve"> </w:t>
-        <acat:field xmlns:acat="https://schemas.acat.akademie.uni-bremen.de" id="64bec828-c0a8-4291-9d50-f73a11cd7036" field="157"/>
+        <acat:field xmlns:acat="https://schemas.acat.akademie.uni-bremen.de" id="0fbaf8cb-c7fa-4e4a-8540-3f088669b737" field="157"/>
         <w:t xml:space="preserve"> </w:t>
-        <acat:block xmlns:acat="https://schemas.acat.akademie.uni-bremen.de" id="7e1170e5-cc09-4633-ae3d-7c6ff8eecdd0" type="end"/>
+        <acat:block xmlns:acat="https://schemas.acat.akademie.uni-bremen.de" id="9954e878-c108-49ed-8696-1079d752f9dd" type="end"/>
       </w:r>
     </w:p>
     <w:p>
@@ -665,33 +665,33 @@
         <w:rPr>
           <w:rFonts w:ascii="Arial" w:hAnsi="Arial" w:cs="Arial"/>
         </w:rPr>
-        <acat:block xmlns:acat="https://schemas.acat.akademie.uni-bremen.de" id="a711f04a-8781-4a06-b430-07ee066552bf" type="start"/>
-      </w:r>
-    </w:p>
-    <w:p>
-      <w:pPr>
-        <w:rPr>
-          <w:rFonts w:ascii="Arial" w:hAnsi="Arial" w:cs="Arial"/>
-        </w:rPr>
-      </w:pPr>
-      <w:r>
-        <w:rPr>
-          <w:rFonts w:ascii="Arial" w:hAnsi="Arial" w:cs="Arial"/>
-        </w:rPr>
-        <acat:field xmlns:acat="https://schemas.acat.akademie.uni-bremen.de" id="b3e70d92-618c-4501-bdc3-f0e64d62514a" field="156"/>
-      </w:r>
-    </w:p>
-    <w:p>
-      <w:pPr>
-        <w:rPr>
-          <w:rFonts w:ascii="Arial" w:hAnsi="Arial" w:cs="Arial"/>
-        </w:rPr>
-      </w:pPr>
-      <w:r>
-        <w:rPr>
-          <w:rFonts w:ascii="Arial" w:hAnsi="Arial" w:cs="Arial"/>
-        </w:rPr>
-        <acat:block xmlns:acat="https://schemas.acat.akademie.uni-bremen.de" id="b9cca9fb-ea58-40e1-9e6b-471615c525aa" type="end"/>
+        <acat:block xmlns:acat="https://schemas.acat.akademie.uni-bremen.de" id="f274ff9c-a095-4178-a15e-46bfc2f18060" type="start"/>
+      </w:r>
+    </w:p>
+    <w:p>
+      <w:pPr>
+        <w:rPr>
+          <w:rFonts w:ascii="Arial" w:hAnsi="Arial" w:cs="Arial"/>
+        </w:rPr>
+      </w:pPr>
+      <w:r>
+        <w:rPr>
+          <w:rFonts w:ascii="Arial" w:hAnsi="Arial" w:cs="Arial"/>
+        </w:rPr>
+        <acat:field xmlns:acat="https://schemas.acat.akademie.uni-bremen.de" id="c67d00cc-0e8f-4476-abbe-22848015ed19" field="156"/>
+      </w:r>
+    </w:p>
+    <w:p>
+      <w:pPr>
+        <w:rPr>
+          <w:rFonts w:ascii="Arial" w:hAnsi="Arial" w:cs="Arial"/>
+        </w:rPr>
+      </w:pPr>
+      <w:r>
+        <w:rPr>
+          <w:rFonts w:ascii="Arial" w:hAnsi="Arial" w:cs="Arial"/>
+        </w:rPr>
+        <acat:block xmlns:acat="https://schemas.acat.akademie.uni-bremen.de" id="209015f3-b2a6-4933-85ed-547a066ec650" type="end"/>
       </w:r>
     </w:p>
     <w:p>
@@ -1082,7 +1082,7 @@
               <w:rPr>
                 <w:rFonts w:ascii="Arial" w:hAnsi="Arial" w:cs="Arial"/>
               </w:rPr>
-              <acat:block xmlns:acat="https://schemas.acat.akademie.uni-bremen.de" id="82e71ce6-7200-4c84-9b97-e3cc8238940e" type="start"/>
+              <acat:block xmlns:acat="https://schemas.acat.akademie.uni-bremen.de" id="9140315d-d3f3-4576-8572-661ce760a9eb" type="start"/>
               <w:t xml:space="preserve"> </w:t>
             </w:r>
           </w:p>
@@ -1101,7 +1101,7 @@
               <w:rPr>
                 <w:rFonts w:ascii="Arial" w:hAnsi="Arial" w:cs="Arial"/>
               </w:rPr>
-              <acat:field xmlns:acat="https://schemas.acat.akademie.uni-bremen.de" id="09192af0-9a82-41e2-b579-6c75a71331f1" field="156"/>
+              <acat:field xmlns:acat="https://schemas.acat.akademie.uni-bremen.de" id="e3f67330-e9d4-41b9-b49a-82604915c489" field="156"/>
             </w:r>
           </w:p>
         </w:tc>
@@ -1119,7 +1119,7 @@
               <w:rPr>
                 <w:rFonts w:ascii="Arial" w:hAnsi="Arial" w:cs="Arial"/>
               </w:rPr>
-              <acat:field xmlns:acat="https://schemas.acat.akademie.uni-bremen.de" id="66d73939-e413-46eb-ae67-989b385b3f4c" field="157"/>
+              <acat:field xmlns:acat="https://schemas.acat.akademie.uni-bremen.de" id="c189e4c5-d136-4ac9-bab3-f2e97d9dd8f2" field="157"/>
             </w:r>
           </w:p>
         </w:tc>
@@ -1137,7 +1137,7 @@
               <w:rPr>
                 <w:rFonts w:ascii="Arial" w:hAnsi="Arial" w:cs="Arial"/>
               </w:rPr>
-              <acat:block xmlns:acat="https://schemas.acat.akademie.uni-bremen.de" id="7e60c755-aec8-423b-bdac-9622924d002c" type="end"/>
+              <acat:block xmlns:acat="https://schemas.acat.akademie.uni-bremen.de" id="20e6b8a2-77b6-4ce9-a844-62eae1fd818c" type="end"/>
             </w:r>
           </w:p>
         </w:tc>
@@ -1868,7 +1868,7 @@
               <w:rPr>
                 <w:rFonts w:ascii="Arial" w:hAnsi="Arial" w:cs="Arial"/>
               </w:rPr>
-              <acat:block xmlns:acat="https://schemas.acat.akademie.uni-bremen.de" id="1aaf0134-2890-4a69-ab47-e85f30332372" type="start"/>
+              <acat:block xmlns:acat="https://schemas.acat.akademie.uni-bremen.de" id="ebd1b25f-9b4c-4d8c-8c9b-12a24c91a6cc" type="start"/>
             </w:r>
           </w:p>
         </w:tc>
@@ -1900,7 +1900,7 @@
               <w:rPr>
                 <w:rFonts w:ascii="Arial" w:hAnsi="Arial" w:cs="Arial"/>
               </w:rPr>
-              <acat:field xmlns:acat="https://schemas.acat.akademie.uni-bremen.de" id="888ddb32-9637-4470-9e38-f3709a8980e7" field="156"/>
+              <acat:field xmlns:acat="https://schemas.acat.akademie.uni-bremen.de" id="40d6054b-7c45-4c9a-bfc6-743d45977e2c" field="156"/>
             </w:r>
           </w:p>
         </w:tc>
@@ -1918,7 +1918,7 @@
               <w:rPr>
                 <w:rFonts w:ascii="Arial" w:hAnsi="Arial" w:cs="Arial"/>
               </w:rPr>
-              <acat:field xmlns:acat="https://schemas.acat.akademie.uni-bremen.de" id="38286af1-bf9d-43d3-828d-3b7f316e2493" field="157"/>
+              <acat:field xmlns:acat="https://schemas.acat.akademie.uni-bremen.de" id="2be190ea-ef16-4096-a236-e17f3ea1ab6d" field="157"/>
             </w:r>
           </w:p>
         </w:tc>
@@ -1939,7 +1939,7 @@
                 <w:rFonts w:ascii="Arial" w:hAnsi="Arial" w:cs="Arial"/>
               </w:rPr>
               <w:lastRenderedPageBreak/>
-              <acat:block xmlns:acat="https://schemas.acat.akademie.uni-bremen.de" id="9bc26fec-97c3-4b93-8893-ef789623c389" type="end"/>
+              <acat:block xmlns:acat="https://schemas.acat.akademie.uni-bremen.de" id="ad5f5e68-3eb4-479c-8d33-ec0365452e8d" type="end"/>
             </w:r>
           </w:p>
         </w:tc>
@@ -2354,7 +2354,7 @@
               <w:rPr>
                 <w:rFonts w:ascii="Arial" w:hAnsi="Arial" w:cs="Arial"/>
               </w:rPr>
-              <acat:block xmlns:acat="https://schemas.acat.akademie.uni-bremen.de" id="435da7de-af2f-4592-9dd0-7c12cdc5a997" type="start"/>
+              <acat:block xmlns:acat="https://schemas.acat.akademie.uni-bremen.de" id="17406c7f-c2fe-4ca2-9983-60a8eed8efee" type="start"/>
             </w:r>
           </w:p>
         </w:tc>
@@ -2392,7 +2392,7 @@
               <w:rPr>
                 <w:rFonts w:ascii="Arial" w:hAnsi="Arial" w:cs="Arial"/>
               </w:rPr>
-              <acat:field xmlns:acat="https://schemas.acat.akademie.uni-bremen.de" id="d7019c31-0077-4f8d-9413-98ecc4e2378c" field="156"/>
+              <acat:field xmlns:acat="https://schemas.acat.akademie.uni-bremen.de" id="8c3a8762-b69e-4c35-ab39-851636700604" field="156"/>
             </w:r>
           </w:p>
         </w:tc>
@@ -2410,7 +2410,7 @@
               <w:rPr>
                 <w:rFonts w:ascii="Arial" w:hAnsi="Arial" w:cs="Arial"/>
               </w:rPr>
-              <acat:field xmlns:acat="https://schemas.acat.akademie.uni-bremen.de" id="da65b802-63d3-4cdc-87e5-49f99067e9e8" field="157"/>
+              <acat:field xmlns:acat="https://schemas.acat.akademie.uni-bremen.de" id="e3fde9d7-5e54-434a-93ae-82580309b459" field="157"/>
             </w:r>
           </w:p>
         </w:tc>
@@ -2430,7 +2430,7 @@
               <w:rPr>
                 <w:rFonts w:ascii="Arial" w:hAnsi="Arial" w:cs="Arial"/>
               </w:rPr>
-              <acat:block xmlns:acat="https://schemas.acat.akademie.uni-bremen.de" id="c51e6e50-60cc-482a-b8d8-0cac13a0fbc7" type="end"/>
+              <acat:block xmlns:acat="https://schemas.acat.akademie.uni-bremen.de" id="2eb39314-adf8-4203-b3a9-918f4787183d" type="end"/>
             </w:r>
           </w:p>
         </w:tc>

</xml_diff>

<commit_message>
refactored tag generator and render engine
</commit_message>
<xml_diff>
--- a/test/Parser/Tag/Resources/tag_generator_test_document_lck.docx
+++ b/test/Parser/Tag/Resources/tag_generator_test_document_lck.docx
@@ -89,7 +89,7 @@
           <w:color w:val="FF0000"/>
           <w:sz w:val="32"/>
         </w:rPr>
-        <acat:field xmlns:acat="https://schemas.acat.akademie.uni-bremen.de" id="47437fb7-144a-4beb-8c1b-6922067623a9" field="1121"/>
+        <acat:field xmlns:acat="https://schemas.acat.akademie.uni-bremen.de" id="57f916a8-9a65-43a0-a9a2-05fba9f95c74" field="1121"/>
       </w:r>
     </w:p>
     <w:p>
@@ -136,9 +136,9 @@
         <w:rPr>
           <w:rFonts w:ascii="Trebuchet MS" w:hAnsi="Trebuchet MS"/>
         </w:rPr>
-        <acat:condition xmlns:acat="https://schemas.acat.akademie.uni-bremen.de" id="182b6bb5-bb16-41c3-9f6c-819a84f61d31" field="1760" action="0"><![CDATA[<>]]></acat:condition>
-        <acat:condition xmlns:acat="https://schemas.acat.akademie.uni-bremen.de" id="b1e690aa-631b-4796-a1f7-763a6bbdf4c7" field="1858" action="0"><![CDATA[=]]></acat:condition>
-        <acat:field xmlns:acat="https://schemas.acat.akademie.uni-bremen.de" id="73320731-2cd3-493b-b410-23fdebe2b086" field="1858"/>
+        <acat:condition xmlns:acat="https://schemas.acat.akademie.uni-bremen.de" id="16ee0446-9b96-408f-9c1d-84347514a7d4" field="1760" action="0"><![CDATA[<>]]></acat:condition>
+        <acat:condition xmlns:acat="https://schemas.acat.akademie.uni-bremen.de" id="a9d35eeb-0d9a-4416-960e-90eec5a0222f" field="1858" action="0"><![CDATA[=]]></acat:condition>
+        <acat:field xmlns:acat="https://schemas.acat.akademie.uni-bremen.de" id="96032099-9866-40c8-9f5d-494a1c4fa128" field="1858"/>
         <w:t xml:space="preserve"> </w:t>
       </w:r>
     </w:p>
@@ -154,9 +154,9 @@
         <w:rPr>
           <w:rFonts w:ascii="Trebuchet MS" w:hAnsi="Trebuchet MS"/>
         </w:rPr>
-        <acat:condition xmlns:acat="https://schemas.acat.akademie.uni-bremen.de" id="51d0d847-bf22-4bed-882e-b0c546a741b6" field="1760" action="0"><![CDATA[<>]]></acat:condition>
-        <acat:condition xmlns:acat="https://schemas.acat.akademie.uni-bremen.de" id="0fe4b0af-d5ff-451c-9ccb-317c5505dd8b" field="1744" action="0"><![CDATA[=]]></acat:condition>
-        <acat:field xmlns:acat="https://schemas.acat.akademie.uni-bremen.de" id="b023d6c5-fa44-43e1-af9d-4f2b85cfb52d" field="1744"/>
+        <acat:condition xmlns:acat="https://schemas.acat.akademie.uni-bremen.de" id="71a186ec-d0a7-40f9-9525-5cb36ee59ab9" field="1760" action="0"><![CDATA[<>]]></acat:condition>
+        <acat:condition xmlns:acat="https://schemas.acat.akademie.uni-bremen.de" id="00ddb67c-c6c2-4d59-bd4c-a6ea4da13fce" field="1744" action="0"><![CDATA[=]]></acat:condition>
+        <acat:field xmlns:acat="https://schemas.acat.akademie.uni-bremen.de" id="594b2416-64ae-472b-ba67-5bc91e4d345a" field="1744"/>
       </w:r>
     </w:p>
     <w:p>
@@ -171,13 +171,13 @@
         <w:rPr>
           <w:rFonts w:ascii="Trebuchet MS" w:hAnsi="Trebuchet MS"/>
         </w:rPr>
-        <acat:condition xmlns:acat="https://schemas.acat.akademie.uni-bremen.de" id="3ba9ba6a-81cf-4a9f-b2d2-e7b06a2fb8b4" field="1760" action="0"><![CDATA[<>]]></acat:condition>
-        <acat:condition xmlns:acat="https://schemas.acat.akademie.uni-bremen.de" id="e842205a-1938-4353-a254-970ee6135919" field="1752" action="2"><![CDATA[=]]></acat:condition>
-        <acat:field xmlns:acat="https://schemas.acat.akademie.uni-bremen.de" id="1ae59de6-0878-4e60-8210-7bb32de63b86" field="1752"/>
+        <acat:condition xmlns:acat="https://schemas.acat.akademie.uni-bremen.de" id="3ff5763a-8c2d-4cb4-a2a9-ab06ddf5bd0f" field="1760" action="0"><![CDATA[<>]]></acat:condition>
+        <acat:condition xmlns:acat="https://schemas.acat.akademie.uni-bremen.de" id="e7c7cbb6-abbc-43a8-9e9a-47d7ee49d9ef" field="1752" action="2"><![CDATA[=]]></acat:condition>
+        <acat:field xmlns:acat="https://schemas.acat.akademie.uni-bremen.de" id="45b8429f-e312-40e2-a617-81d43df6600f" field="1752"/>
         <w:t xml:space="preserve"> </w:t>
-        <acat:field xmlns:acat="https://schemas.acat.akademie.uni-bremen.de" id="563c1f38-4e53-406b-bbd9-fab07946958b" field="1745"/>
+        <acat:field xmlns:acat="https://schemas.acat.akademie.uni-bremen.de" id="39be90e6-d7fa-4971-8b4f-c11856774736" field="1745"/>
         <w:t xml:space="preserve"> </w:t>
-        <acat:field xmlns:acat="https://schemas.acat.akademie.uni-bremen.de" id="bb7b0ef0-7e50-46ec-8d92-e24c1e57afb3" field="1747"/>
+        <acat:field xmlns:acat="https://schemas.acat.akademie.uni-bremen.de" id="45c66990-fe25-433d-9504-d946b42c6c99" field="1747"/>
       </w:r>
     </w:p>
     <w:p>
@@ -192,8 +192,8 @@
         <w:rPr>
           <w:rFonts w:ascii="Trebuchet MS" w:hAnsi="Trebuchet MS"/>
         </w:rPr>
-        <acat:condition xmlns:acat="https://schemas.acat.akademie.uni-bremen.de" id="488b6055-4157-4f58-ad22-3d7d76d2a01b" field="1760" action="0"><![CDATA[<>]]></acat:condition>
-        <acat:field xmlns:acat="https://schemas.acat.akademie.uni-bremen.de" id="a2d0eee1-c6c1-4c62-8e00-7f24e38fbe67" field="1748"/>
+        <acat:condition xmlns:acat="https://schemas.acat.akademie.uni-bremen.de" id="500192c6-a64c-4493-a296-f27fa2aa8ef2" field="1760" action="0"><![CDATA[<>]]></acat:condition>
+        <acat:field xmlns:acat="https://schemas.acat.akademie.uni-bremen.de" id="43690693-c4ce-4142-864c-05979c8db4b7" field="1748"/>
       </w:r>
     </w:p>
     <w:p>
@@ -208,10 +208,10 @@
         <w:rPr>
           <w:rFonts w:ascii="Trebuchet MS" w:hAnsi="Trebuchet MS"/>
         </w:rPr>
-        <acat:condition xmlns:acat="https://schemas.acat.akademie.uni-bremen.de" id="01818ad2-0d73-4372-bf00-931e027e83eb" field="1760" action="0"><![CDATA[<>]]></acat:condition>
-        <acat:field xmlns:acat="https://schemas.acat.akademie.uni-bremen.de" id="b583e029-2714-41b9-b1e5-59849c25e72a" field="1749"/>
+        <acat:condition xmlns:acat="https://schemas.acat.akademie.uni-bremen.de" id="6f413aa8-36d8-4e90-b1f9-910210684048" field="1760" action="0"><![CDATA[<>]]></acat:condition>
+        <acat:field xmlns:acat="https://schemas.acat.akademie.uni-bremen.de" id="bd9407ce-8756-4772-a6d4-4315748e428c" field="1749"/>
         <w:t xml:space="preserve"> </w:t>
-        <acat:field xmlns:acat="https://schemas.acat.akademie.uni-bremen.de" id="8cb4512f-0d9a-444c-b4e0-7139d1059599" field="1750"/>
+        <acat:field xmlns:acat="https://schemas.acat.akademie.uni-bremen.de" id="aedd1c92-a5e0-4542-8503-5d7605cdfbb4" field="1750"/>
       </w:r>
     </w:p>
     <w:p>
@@ -226,8 +226,8 @@
         <w:rPr>
           <w:rFonts w:ascii="Trebuchet MS" w:hAnsi="Trebuchet MS"/>
         </w:rPr>
-        <acat:condition xmlns:acat="https://schemas.acat.akademie.uni-bremen.de" id="064090ce-5e4b-40cc-bd2c-2f670d766cae" field="1757" action="0"><![CDATA[=]]></acat:condition>
-        <acat:field xmlns:acat="https://schemas.acat.akademie.uni-bremen.de" id="671b8d92-b1d5-40e2-9336-f70cd6a8d237" field="1757"/>
+        <acat:condition xmlns:acat="https://schemas.acat.akademie.uni-bremen.de" id="3f83784b-41b7-4714-9ce9-b48d622e5635" field="1757" action="0"><![CDATA[=]]></acat:condition>
+        <acat:field xmlns:acat="https://schemas.acat.akademie.uni-bremen.de" id="ba16597a-ad29-41cc-80fa-1a0ff499f3f4" field="1757"/>
         <w:t xml:space="preserve"> </w:t>
       </w:r>
     </w:p>
@@ -243,8 +243,8 @@
         <w:rPr>
           <w:rFonts w:ascii="Trebuchet MS" w:hAnsi="Trebuchet MS"/>
         </w:rPr>
-        <acat:condition xmlns:acat="https://schemas.acat.akademie.uni-bremen.de" id="43962b98-e2e1-4d7d-948a-dcd15264f4cb" field="1860" action="0"><![CDATA[=]]></acat:condition>
-        <acat:field xmlns:acat="https://schemas.acat.akademie.uni-bremen.de" id="dc38e7ee-0c82-457c-a852-0a9851989e6a" field="1860"/>
+        <acat:condition xmlns:acat="https://schemas.acat.akademie.uni-bremen.de" id="4b02f30e-865a-4a52-b026-478fa0891164" field="1860" action="0"><![CDATA[=]]></acat:condition>
+        <acat:field xmlns:acat="https://schemas.acat.akademie.uni-bremen.de" id="6ea01684-e06f-4f0a-b8b6-1e4f34f44fd4" field="1860"/>
         <w:t xml:space="preserve"> </w:t>
       </w:r>
     </w:p>
@@ -260,10 +260,10 @@
         <w:rPr>
           <w:rFonts w:ascii="Trebuchet MS" w:hAnsi="Trebuchet MS"/>
         </w:rPr>
-        <acat:condition xmlns:acat="https://schemas.acat.akademie.uni-bremen.de" id="591123c3-355d-4187-a21d-c036a87f6ee2" field="1862" action="0"><![CDATA[=]]></acat:condition>
-        <acat:field xmlns:acat="https://schemas.acat.akademie.uni-bremen.de" id="d278ec3e-2826-4b8c-be55-4638b1ddfa13" field="1862"/>
+        <acat:condition xmlns:acat="https://schemas.acat.akademie.uni-bremen.de" id="3532c9da-1ce9-4682-813b-29f046803760" field="1862" action="0"><![CDATA[=]]></acat:condition>
+        <acat:field xmlns:acat="https://schemas.acat.akademie.uni-bremen.de" id="4c2f84bd-d783-4723-8fb3-f48ec4f14076" field="1862"/>
         <w:t xml:space="preserve"> </w:t>
-        <acat:field xmlns:acat="https://schemas.acat.akademie.uni-bremen.de" id="234afb3a-088c-46c0-bc6f-ac35cdebe4f2" field="1863"/>
+        <acat:field xmlns:acat="https://schemas.acat.akademie.uni-bremen.de" id="4dd9083e-3bf1-4caa-8ced-47d2f38b6374" field="1863"/>
       </w:r>
     </w:p>
     <w:p>
@@ -278,8 +278,8 @@
         <w:rPr>
           <w:rFonts w:ascii="Trebuchet MS" w:hAnsi="Trebuchet MS"/>
         </w:rPr>
-        <acat:condition xmlns:acat="https://schemas.acat.akademie.uni-bremen.de" id="931e80a6-fcae-4add-9e2f-9f14cb83d6fd" field="1760" action="0"><![CDATA[=]]></acat:condition>
-        <acat:field xmlns:acat="https://schemas.acat.akademie.uni-bremen.de" id="a6e6db10-023d-461e-9c78-d44d72584f20" field="1760"/>
+        <acat:condition xmlns:acat="https://schemas.acat.akademie.uni-bremen.de" id="f6ef83f8-287d-4776-8312-848790868780" field="1760" action="0"><![CDATA[=]]></acat:condition>
+        <acat:field xmlns:acat="https://schemas.acat.akademie.uni-bremen.de" id="08d5cdef-ad17-4bb3-96b0-4b5585d0f847" field="1760"/>
       </w:r>
     </w:p>
     <w:p>
@@ -294,10 +294,10 @@
         <w:rPr>
           <w:rFonts w:ascii="Trebuchet MS" w:hAnsi="Trebuchet MS"/>
         </w:rPr>
-        <acat:condition xmlns:acat="https://schemas.acat.akademie.uni-bremen.de" id="5473e523-296d-47a8-af88-cb9da83c0bc1" field="1761" action="0"><![CDATA[=]]></acat:condition>
-        <acat:field xmlns:acat="https://schemas.acat.akademie.uni-bremen.de" id="2994e917-0e5d-4530-9169-db4d152c5b32" field="1761"/>
+        <acat:condition xmlns:acat="https://schemas.acat.akademie.uni-bremen.de" id="a21c338f-55d9-4801-9a46-fe47253a5a22" field="1761" action="0"><![CDATA[=]]></acat:condition>
+        <acat:field xmlns:acat="https://schemas.acat.akademie.uni-bremen.de" id="d215e9b6-d98b-4c5f-a2c3-9f8376f9b217" field="1761"/>
         <w:t xml:space="preserve"> </w:t>
-        <acat:field xmlns:acat="https://schemas.acat.akademie.uni-bremen.de" id="b8f33edf-d3e8-4d21-b0c9-b2e857131fc4" field="1762"/>
+        <acat:field xmlns:acat="https://schemas.acat.akademie.uni-bremen.de" id="ff05ea55-fc26-4bce-a1cc-170dc9b8d864" field="1762"/>
       </w:r>
     </w:p>
     <w:p>
@@ -326,7 +326,7 @@
         <w:rPr>
           <w:rFonts w:ascii="Trebuchet MS" w:hAnsi="Trebuchet MS"/>
         </w:rPr>
-        <acat:field xmlns:acat="https://schemas.acat.akademie.uni-bremen.de" id="745bbfe0-e493-4f2e-a2af-ee181c5b967c" field="1858"/>
+        <acat:field xmlns:acat="https://schemas.acat.akademie.uni-bremen.de" id="b7dc7ee3-1683-46b5-bd69-702b7cda941f" field="1858"/>
       </w:r>
       <w:r>
         <w:rPr>
@@ -338,7 +338,7 @@
         <w:rPr>
           <w:rFonts w:ascii="Trebuchet MS" w:hAnsi="Trebuchet MS"/>
         </w:rPr>
-        <acat:field xmlns:acat="https://schemas.acat.akademie.uni-bremen.de" id="8de103a3-c86a-40f4-b7e7-47bc2adcbddf" field="1762"/>
+        <acat:field xmlns:acat="https://schemas.acat.akademie.uni-bremen.de" id="001561fa-2f5e-44e4-abc8-717241173277" field="1762"/>
       </w:r>
       <w:r>
         <w:rPr>
@@ -350,16 +350,16 @@
         <w:rPr>
           <w:rFonts w:ascii="Trebuchet MS" w:hAnsi="Trebuchet MS"/>
         </w:rPr>
-        <acat:field xmlns:acat="https://schemas.acat.akademie.uni-bremen.de" id="219d176e-5112-4005-a0ae-cd1a5a8edeb7" field="1757"/>
+        <acat:field xmlns:acat="https://schemas.acat.akademie.uni-bremen.de" id="c3cfea22-476e-463d-a063-a5d41c0f8b64" field="1757"/>
       </w:r>
       <w:r>
         <w:rPr>
           <w:rFonts w:ascii="Trebuchet MS" w:hAnsi="Trebuchet MS"/>
         </w:rPr>
         <w:t xml:space="preserve"> Felder einbauen, sonst spiegelt das ja nicht wirklich die Realität wieder. Aber was wäre das Leben ohne die Möglichkeit Entscheidungen treffen zu können!? Deswegen </w:t>
-        <acat:condition xmlns:acat="https://schemas.acat.akademie.uni-bremen.de" id="474a1be3-406b-4b03-a73a-c307985c0e9a" field="1760" action="0"><![CDATA[=]]></acat:condition>
+        <acat:condition xmlns:acat="https://schemas.acat.akademie.uni-bremen.de" id="eb9bb6ff-61ea-40bc-9012-6bee554c1b34" field="1760" action="0"><![CDATA[=]]></acat:condition>
         <w:t xml:space="preserve"> </w:t>
-        <acat:text xmlns:acat="https://schemas.acat.akademie.uni-bremen.de" id="87d13521-1982-4613-97ea-8ae7589c9565" space="preserve">Hurray</acat:text>
+        <acat:text xmlns:acat="https://schemas.acat.akademie.uni-bremen.de" id="e4f9a194-4865-4d8d-a661-8cdbbcb7142a" space="preserve">Hurray</acat:text>
         <w:t xml:space="preserve">. Läuft, oder!? :-P </w:t>
       </w:r>
       <w:proofErr w:type="spellStart"/>
@@ -397,7 +397,7 @@
         <w:rPr>
           <w:rFonts w:ascii="Trebuchet MS" w:hAnsi="Trebuchet MS"/>
         </w:rPr>
-        <acat:field xmlns:acat="https://schemas.acat.akademie.uni-bremen.de" id="79c53244-d5ca-420d-b4c8-c27dcdaeb689" field="156"/>
+        <acat:field xmlns:acat="https://schemas.acat.akademie.uni-bremen.de" id="d7f817ab-4730-42b6-b215-b408448ae5dc" field="156"/>
         <w:t xml:space="preserve"> Es soll das Feld mit der ID 156 gedruckt werden</w:t>
       </w:r>
     </w:p>
@@ -436,7 +436,7 @@
         <w:rPr>
           <w:rFonts w:ascii="Trebuchet MS" w:hAnsi="Trebuchet MS"/>
         </w:rPr>
-        <acat:text xmlns:acat="https://schemas.acat.akademie.uni-bremen.de" id="aef40cfb-3834-4945-889e-9d79135ba6ef" space="preserve">FOO BAR</acat:text>
+        <acat:text xmlns:acat="https://schemas.acat.akademie.uni-bremen.de" id="e4634fed-3866-4d0e-9604-e4609830c3c5" space="preserve">FOO BAR</acat:text>
         <w:t xml:space="preserve"> Hier handelt es sich um ein Textfeld, welches den Inhalt „FOO BAR“ ausdruckt.</w:t>
       </w:r>
     </w:p>
@@ -506,7 +506,7 @@
         <w:rPr>
           <w:rFonts w:ascii="Arial" w:hAnsi="Arial" w:cs="Arial"/>
         </w:rPr>
-        <acat:block xmlns:acat="https://schemas.acat.akademie.uni-bremen.de" id="7f806316-ed1e-46b2-9e51-a38f5766d4cd" type="start"/>
+        <acat:block xmlns:acat="https://schemas.acat.akademie.uni-bremen.de" id="1b81edb4-2c7c-4180-b54b-89d1314dad5d" type="start"/>
       </w:r>
     </w:p>
     <w:p>
@@ -520,20 +520,20 @@
         <w:rPr>
           <w:rFonts w:ascii="Arial" w:hAnsi="Arial" w:cs="Arial"/>
         </w:rPr>
-        <acat:field xmlns:acat="https://schemas.acat.akademie.uni-bremen.de" id="bcaa4104-696f-42a8-b87d-8ec630994ef1" field="156"/>
-      </w:r>
-    </w:p>
-    <w:p>
-      <w:pPr>
-        <w:rPr>
-          <w:rFonts w:ascii="Arial" w:hAnsi="Arial" w:cs="Arial"/>
-        </w:rPr>
-      </w:pPr>
-      <w:r>
-        <w:rPr>
-          <w:rFonts w:ascii="Arial" w:hAnsi="Arial" w:cs="Arial"/>
-        </w:rPr>
-        <acat:block xmlns:acat="https://schemas.acat.akademie.uni-bremen.de" id="fc38401a-c235-4e98-b324-211d62eba794" type="end"/>
+        <acat:field xmlns:acat="https://schemas.acat.akademie.uni-bremen.de" id="a8ff0354-8177-4657-a6e2-4d91c92b1661" field="156"/>
+      </w:r>
+    </w:p>
+    <w:p>
+      <w:pPr>
+        <w:rPr>
+          <w:rFonts w:ascii="Arial" w:hAnsi="Arial" w:cs="Arial"/>
+        </w:rPr>
+      </w:pPr>
+      <w:r>
+        <w:rPr>
+          <w:rFonts w:ascii="Arial" w:hAnsi="Arial" w:cs="Arial"/>
+        </w:rPr>
+        <acat:block xmlns:acat="https://schemas.acat.akademie.uni-bremen.de" id="69679eb3-1f58-43b8-8fb9-d6b3e202b949" type="end"/>
       </w:r>
     </w:p>
     <w:p>
@@ -633,11 +633,11 @@
         <w:rPr>
           <w:rFonts w:ascii="Arial" w:hAnsi="Arial" w:cs="Arial"/>
         </w:rPr>
-        <acat:block xmlns:acat="https://schemas.acat.akademie.uni-bremen.de" id="bf00fa17-7c2c-4b00-9996-ba968e4177f9" type="start"/>
+        <acat:block xmlns:acat="https://schemas.acat.akademie.uni-bremen.de" id="9381d1d2-067b-48eb-b4bc-c540e1b7c582" type="start"/>
         <w:t xml:space="preserve"> </w:t>
-        <acat:field xmlns:acat="https://schemas.acat.akademie.uni-bremen.de" id="26f89d0d-b461-4fa4-b608-b53437c80860" field="157"/>
+        <acat:field xmlns:acat="https://schemas.acat.akademie.uni-bremen.de" id="e83b60aa-5065-43ab-85ea-51e9aabd9fd8" field="157"/>
         <w:t xml:space="preserve"> </w:t>
-        <acat:block xmlns:acat="https://schemas.acat.akademie.uni-bremen.de" id="24ee57a8-ce20-4df8-826b-bc536453d175" type="end"/>
+        <acat:block xmlns:acat="https://schemas.acat.akademie.uni-bremen.de" id="bb160742-cdcb-49cd-8339-e9e15c1b95a1" type="end"/>
       </w:r>
     </w:p>
     <w:p>
@@ -665,33 +665,33 @@
         <w:rPr>
           <w:rFonts w:ascii="Arial" w:hAnsi="Arial" w:cs="Arial"/>
         </w:rPr>
-        <acat:block xmlns:acat="https://schemas.acat.akademie.uni-bremen.de" id="6fba1444-f81c-4438-8431-413e5a104aed" type="start"/>
-      </w:r>
-    </w:p>
-    <w:p>
-      <w:pPr>
-        <w:rPr>
-          <w:rFonts w:ascii="Arial" w:hAnsi="Arial" w:cs="Arial"/>
-        </w:rPr>
-      </w:pPr>
-      <w:r>
-        <w:rPr>
-          <w:rFonts w:ascii="Arial" w:hAnsi="Arial" w:cs="Arial"/>
-        </w:rPr>
-        <acat:field xmlns:acat="https://schemas.acat.akademie.uni-bremen.de" id="8b7885d2-0f91-4864-8c8e-e71847de60ef" field="156"/>
-      </w:r>
-    </w:p>
-    <w:p>
-      <w:pPr>
-        <w:rPr>
-          <w:rFonts w:ascii="Arial" w:hAnsi="Arial" w:cs="Arial"/>
-        </w:rPr>
-      </w:pPr>
-      <w:r>
-        <w:rPr>
-          <w:rFonts w:ascii="Arial" w:hAnsi="Arial" w:cs="Arial"/>
-        </w:rPr>
-        <acat:block xmlns:acat="https://schemas.acat.akademie.uni-bremen.de" id="56c22455-24dc-449e-9c10-61366a1a3873" type="end"/>
+        <acat:block xmlns:acat="https://schemas.acat.akademie.uni-bremen.de" id="06ccab27-7df1-4ece-88f5-04972c679907" type="start"/>
+      </w:r>
+    </w:p>
+    <w:p>
+      <w:pPr>
+        <w:rPr>
+          <w:rFonts w:ascii="Arial" w:hAnsi="Arial" w:cs="Arial"/>
+        </w:rPr>
+      </w:pPr>
+      <w:r>
+        <w:rPr>
+          <w:rFonts w:ascii="Arial" w:hAnsi="Arial" w:cs="Arial"/>
+        </w:rPr>
+        <acat:field xmlns:acat="https://schemas.acat.akademie.uni-bremen.de" id="1ddd002f-8de7-4723-9db5-5ddf604167be" field="156"/>
+      </w:r>
+    </w:p>
+    <w:p>
+      <w:pPr>
+        <w:rPr>
+          <w:rFonts w:ascii="Arial" w:hAnsi="Arial" w:cs="Arial"/>
+        </w:rPr>
+      </w:pPr>
+      <w:r>
+        <w:rPr>
+          <w:rFonts w:ascii="Arial" w:hAnsi="Arial" w:cs="Arial"/>
+        </w:rPr>
+        <acat:block xmlns:acat="https://schemas.acat.akademie.uni-bremen.de" id="6e57bf3e-376b-4a59-b15e-9875c764a078" type="end"/>
       </w:r>
     </w:p>
     <w:p>
@@ -1082,7 +1082,7 @@
               <w:rPr>
                 <w:rFonts w:ascii="Arial" w:hAnsi="Arial" w:cs="Arial"/>
               </w:rPr>
-              <acat:block xmlns:acat="https://schemas.acat.akademie.uni-bremen.de" id="953e9683-2546-4c3c-9612-34d1fbec60a3" type="start"/>
+              <acat:block xmlns:acat="https://schemas.acat.akademie.uni-bremen.de" id="79eabf4d-3c23-4884-b649-a9bd95221dd1" type="start"/>
               <w:t xml:space="preserve"> </w:t>
             </w:r>
           </w:p>
@@ -1101,7 +1101,7 @@
               <w:rPr>
                 <w:rFonts w:ascii="Arial" w:hAnsi="Arial" w:cs="Arial"/>
               </w:rPr>
-              <acat:field xmlns:acat="https://schemas.acat.akademie.uni-bremen.de" id="7116e1c0-5e69-4718-b5de-43c78abc95af" field="156"/>
+              <acat:field xmlns:acat="https://schemas.acat.akademie.uni-bremen.de" id="a3ee2ae9-a47f-48fa-9960-2cde984bd6f2" field="156"/>
             </w:r>
           </w:p>
         </w:tc>
@@ -1119,7 +1119,7 @@
               <w:rPr>
                 <w:rFonts w:ascii="Arial" w:hAnsi="Arial" w:cs="Arial"/>
               </w:rPr>
-              <acat:field xmlns:acat="https://schemas.acat.akademie.uni-bremen.de" id="d9ed9db6-7233-474f-b6f6-05112f9d4d8f" field="157"/>
+              <acat:field xmlns:acat="https://schemas.acat.akademie.uni-bremen.de" id="12ab3ca9-816e-4b17-b173-26d3379f58d5" field="157"/>
             </w:r>
           </w:p>
         </w:tc>
@@ -1137,7 +1137,7 @@
               <w:rPr>
                 <w:rFonts w:ascii="Arial" w:hAnsi="Arial" w:cs="Arial"/>
               </w:rPr>
-              <acat:block xmlns:acat="https://schemas.acat.akademie.uni-bremen.de" id="bfb7e14a-2496-424e-be9d-10b0978ed794" type="end"/>
+              <acat:block xmlns:acat="https://schemas.acat.akademie.uni-bremen.de" id="fce3157a-4673-46dc-927b-dbfd717da59d" type="end"/>
             </w:r>
           </w:p>
         </w:tc>
@@ -1868,7 +1868,7 @@
               <w:rPr>
                 <w:rFonts w:ascii="Arial" w:hAnsi="Arial" w:cs="Arial"/>
               </w:rPr>
-              <acat:block xmlns:acat="https://schemas.acat.akademie.uni-bremen.de" id="a5d65f30-aa83-4e84-840c-3c994b32ab1c" type="start"/>
+              <acat:block xmlns:acat="https://schemas.acat.akademie.uni-bremen.de" id="4d31efbb-d6cc-4502-84ad-e45804847f89" type="start"/>
             </w:r>
           </w:p>
         </w:tc>
@@ -1900,7 +1900,7 @@
               <w:rPr>
                 <w:rFonts w:ascii="Arial" w:hAnsi="Arial" w:cs="Arial"/>
               </w:rPr>
-              <acat:field xmlns:acat="https://schemas.acat.akademie.uni-bremen.de" id="db973675-842d-4066-a50c-dca2fe3f14f4" field="156"/>
+              <acat:field xmlns:acat="https://schemas.acat.akademie.uni-bremen.de" id="08b70296-7b77-4d4e-afc0-a49ca5ff8533" field="156"/>
             </w:r>
           </w:p>
         </w:tc>
@@ -1918,7 +1918,7 @@
               <w:rPr>
                 <w:rFonts w:ascii="Arial" w:hAnsi="Arial" w:cs="Arial"/>
               </w:rPr>
-              <acat:field xmlns:acat="https://schemas.acat.akademie.uni-bremen.de" id="8bc2ec1e-4fc9-41b4-94df-47bb6a18ef0e" field="157"/>
+              <acat:field xmlns:acat="https://schemas.acat.akademie.uni-bremen.de" id="d69e3387-b7b2-450b-8342-7b1243ec5090" field="157"/>
             </w:r>
           </w:p>
         </w:tc>
@@ -1939,7 +1939,7 @@
                 <w:rFonts w:ascii="Arial" w:hAnsi="Arial" w:cs="Arial"/>
               </w:rPr>
               <w:lastRenderedPageBreak/>
-              <acat:block xmlns:acat="https://schemas.acat.akademie.uni-bremen.de" id="12b65ffb-f898-4e48-8ca9-870fad30994a" type="end"/>
+              <acat:block xmlns:acat="https://schemas.acat.akademie.uni-bremen.de" id="4534532a-f648-4efa-8437-8780bc72da12" type="end"/>
             </w:r>
           </w:p>
         </w:tc>
@@ -2354,7 +2354,7 @@
               <w:rPr>
                 <w:rFonts w:ascii="Arial" w:hAnsi="Arial" w:cs="Arial"/>
               </w:rPr>
-              <acat:block xmlns:acat="https://schemas.acat.akademie.uni-bremen.de" id="fb70a891-e8f9-466a-a34c-f90888306d7f" type="start"/>
+              <acat:block xmlns:acat="https://schemas.acat.akademie.uni-bremen.de" id="718f1375-a2ec-4598-be57-85cbd3650372" type="start"/>
             </w:r>
           </w:p>
         </w:tc>
@@ -2392,7 +2392,7 @@
               <w:rPr>
                 <w:rFonts w:ascii="Arial" w:hAnsi="Arial" w:cs="Arial"/>
               </w:rPr>
-              <acat:field xmlns:acat="https://schemas.acat.akademie.uni-bremen.de" id="99651fd0-8685-4697-af5b-3717c9a0c73b" field="156"/>
+              <acat:field xmlns:acat="https://schemas.acat.akademie.uni-bremen.de" id="d9bd40fb-f805-42e0-bb86-b7f84658f601" field="156"/>
             </w:r>
           </w:p>
         </w:tc>
@@ -2410,7 +2410,7 @@
               <w:rPr>
                 <w:rFonts w:ascii="Arial" w:hAnsi="Arial" w:cs="Arial"/>
               </w:rPr>
-              <acat:field xmlns:acat="https://schemas.acat.akademie.uni-bremen.de" id="e9cc8b82-05dc-4713-bbe8-83a130e84d24" field="157"/>
+              <acat:field xmlns:acat="https://schemas.acat.akademie.uni-bremen.de" id="5cdddc93-d419-49f9-8c84-2bf5baad592a" field="157"/>
             </w:r>
           </w:p>
         </w:tc>
@@ -2430,7 +2430,7 @@
               <w:rPr>
                 <w:rFonts w:ascii="Arial" w:hAnsi="Arial" w:cs="Arial"/>
               </w:rPr>
-              <acat:block xmlns:acat="https://schemas.acat.akademie.uni-bremen.de" id="dcef450f-0971-4666-91a1-846ea323a6ae" type="end"/>
+              <acat:block xmlns:acat="https://schemas.acat.akademie.uni-bremen.de" id="968d7e00-0dc2-4f96-9541-b09e9e036674" type="end"/>
             </w:r>
           </w:p>
         </w:tc>

</xml_diff>